<commit_message>
Liability field-ləri elave edildi: 37 field + CreditHistoryLine + SOAP response XML
</commit_message>
<xml_diff>
--- a/Tekniki_Inteqrasiya_Senedi.docx
+++ b/Tekniki_Inteqrasiya_Senedi.docx
@@ -11529,7 +11529,2537 @@
           <w:sz w:val="28"/>
           <w:szCs w:val="28"/>
         </w:rPr>
-        <w:t xml:space="preserve">3.7 Field Descriptions (English)</w:t>
+        <w:t xml:space="preserve">3.7 Liability (Kredit Öhdəliyi) Field-ləri</w:t>
+      </w:r>
+    </w:p>
+    <w:p>
+      <w:pPr>
+        <w:spacing w:after="80" w:before="80"/>
+      </w:pPr>
+      <w:r>
+        <w:rPr>
+          <w:rFonts w:ascii="Calibri" w:cs="Calibri" w:eastAsia="Calibri" w:hAnsi="Calibri"/>
+          <w:i/>
+          <w:iCs/>
+          <w:color w:val="64748B"/>
+          <w:sz w:val="18"/>
+          <w:szCs w:val="18"/>
+        </w:rPr>
+        <w:t xml:space="preserve">Cədvəl 3.6 — Liability obyektinin field-ləri (37 field + 1 nəstə obyekt)</w:t>
+      </w:r>
+    </w:p>
+    <w:tbl>
+      <w:tblPr>
+        <w:tblStyle w:val="TableGrid"/>
+        <w:tblW w:w="0" w:type="auto"/>
+        <w:tblBorders>
+          <w:top w:val="single" w:sz="12" w:color="9AA6B2"/>
+          <w:bottom w:val="single" w:sz="12" w:color="9AA6B2"/>
+          <w:insideH w:val="single" w:sz="4" w:color="D1D5DB"/>
+          <w:left w:val="nil"/>
+          <w:right w:val="nil"/>
+        </w:tblBorders>
+      </w:tblPr>
+      <w:tblGrid>
+        <w:gridCol w:w="2400"/>
+        <w:gridCol w:w="1600"/>
+        <w:gridCol w:w="5300"/>
+      </w:tblGrid>
+      <w:tc>
+        <w:tcPr>
+          <w:tcW w:w="2400" w:type="dxa"/>
+          <w:shd w:fill="020617" w:val="clear"/>
+        </w:tcPr>
+        <w:p>
+          <w:pPr>
+            <w:spacing w:after="60" w:before="60" w:line="250"/>
+            <w:jc w:val="left"/>
+          </w:pPr>
+          <w:r>
+            <w:rPr>
+              <w:rFonts w:ascii="Calibri" w:cs="Calibri" w:eastAsia="Calibri" w:hAnsi="Calibri"/>
+              <w:b/>
+              <w:bCs/>
+              <w:color w:val="FFFFFF"/>
+              <w:sz w:val="19"/>
+              <w:szCs w:val="19"/>
+            </w:rPr>
+            <w:t>Field Name</w:t>
+          </w:r>
+        </w:p>
+      </w:tc>
+      <w:tc>
+        <w:tcPr>
+          <w:tcW w:w="1600" w:type="dxa"/>
+          <w:shd w:fill="020617" w:val="clear"/>
+        </w:tcPr>
+        <w:p>
+          <w:pPr>
+            <w:spacing w:after="60" w:before="60" w:line="250"/>
+            <w:jc w:val="left"/>
+          </w:pPr>
+          <w:r>
+            <w:rPr>
+              <w:rFonts w:ascii="Calibri" w:cs="Calibri" w:eastAsia="Calibri" w:hAnsi="Calibri"/>
+              <w:b/>
+              <w:bCs/>
+              <w:color w:val="FFFFFF"/>
+              <w:sz w:val="19"/>
+              <w:szCs w:val="19"/>
+            </w:rPr>
+            <w:t>Type</w:t>
+          </w:r>
+        </w:p>
+      </w:tc>
+      <w:tc>
+        <w:tcPr>
+          <w:tcW w:w="5300" w:type="dxa"/>
+          <w:shd w:fill="020617" w:val="clear"/>
+        </w:tcPr>
+        <w:p>
+          <w:pPr>
+            <w:spacing w:after="60" w:before="60" w:line="250"/>
+            <w:jc w:val="left"/>
+          </w:pPr>
+          <w:r>
+            <w:rPr>
+              <w:rFonts w:ascii="Calibri" w:cs="Calibri" w:eastAsia="Calibri" w:hAnsi="Calibri"/>
+              <w:b/>
+              <w:bCs/>
+              <w:color w:val="FFFFFF"/>
+              <w:sz w:val="19"/>
+              <w:szCs w:val="19"/>
+            </w:rPr>
+            <w:t>Description (EN)</w:t>
+          </w:r>
+        </w:p>
+      </w:tc>
+      <w:tc>
+        <w:tcPr>
+          <w:tcW w:w="2400" w:type="dxa"/>
+        </w:tcPr>
+        <w:p>
+          <w:pPr>
+            <w:spacing w:after="40" w:before="40" w:line="250"/>
+          </w:pPr>
+          <w:r>
+            <w:rPr>
+              <w:rFonts w:ascii="Courier New" w:cs="Courier New" w:eastAsia="Courier New" w:hAnsi="Courier New"/>
+              <w:color w:val="1E293B"/>
+              <w:sz w:val="18"/>
+              <w:szCs w:val="18"/>
+            </w:rPr>
+            <w:t>id</w:t>
+          </w:r>
+        </w:p>
+      </w:tc>
+      <w:tc>
+        <w:tcPr>
+          <w:tcW w:w="1600" w:type="dxa"/>
+        </w:tcPr>
+        <w:p>
+          <w:pPr>
+            <w:spacing w:after="40" w:before="40" w:line="250"/>
+          </w:pPr>
+          <w:r>
+            <w:rPr>
+              <w:rFonts w:ascii="Courier New" w:cs="Courier New" w:eastAsia="Courier New" w:hAnsi="Courier New"/>
+              <w:color w:val="1E293B"/>
+              <w:sz w:val="18"/>
+              <w:szCs w:val="18"/>
+            </w:rPr>
+            <w:t>String</w:t>
+          </w:r>
+        </w:p>
+      </w:tc>
+      <w:tc>
+        <w:tcPr>
+          <w:tcW w:w="5300" w:type="dxa"/>
+        </w:tcPr>
+        <w:p>
+          <w:pPr>
+            <w:spacing w:after="40" w:before="40" w:line="250"/>
+          </w:pPr>
+          <w:r>
+            <w:rPr>
+              <w:rFonts w:ascii="Calibri" w:cs="Calibri" w:eastAsia="Calibri" w:hAnsi="Calibri"/>
+              <w:color w:val="1E293B"/>
+              <w:sz w:val="18"/>
+              <w:szCs w:val="18"/>
+            </w:rPr>
+            <w:t>Unique liability record identifier</w:t>
+          </w:r>
+        </w:p>
+      </w:tc>
+      <w:tc>
+        <w:tcPr>
+          <w:tcW w:w="2400" w:type="dxa"/>
+        </w:tcPr>
+        <w:p>
+          <w:pPr>
+            <w:spacing w:after="40" w:before="40" w:line="250"/>
+          </w:pPr>
+          <w:r>
+            <w:rPr>
+              <w:rFonts w:ascii="Courier New" w:cs="Courier New" w:eastAsia="Courier New" w:hAnsi="Courier New"/>
+              <w:color w:val="1E293B"/>
+              <w:sz w:val="18"/>
+              <w:szCs w:val="18"/>
+            </w:rPr>
+            <w:t>bankId</w:t>
+          </w:r>
+        </w:p>
+      </w:tc>
+      <w:tc>
+        <w:tcPr>
+          <w:tcW w:w="1600" w:type="dxa"/>
+        </w:tcPr>
+        <w:p>
+          <w:pPr>
+            <w:spacing w:after="40" w:before="40" w:line="250"/>
+          </w:pPr>
+          <w:r>
+            <w:rPr>
+              <w:rFonts w:ascii="Courier New" w:cs="Courier New" w:eastAsia="Courier New" w:hAnsi="Courier New"/>
+              <w:color w:val="1E293B"/>
+              <w:sz w:val="18"/>
+              <w:szCs w:val="18"/>
+            </w:rPr>
+            <w:t>String</w:t>
+          </w:r>
+        </w:p>
+      </w:tc>
+      <w:tc>
+        <w:tcPr>
+          <w:tcW w:w="5300" w:type="dxa"/>
+        </w:tcPr>
+        <w:p>
+          <w:pPr>
+            <w:spacing w:after="40" w:before="40" w:line="250"/>
+          </w:pPr>
+          <w:r>
+            <w:rPr>
+              <w:rFonts w:ascii="Calibri" w:cs="Calibri" w:eastAsia="Calibri" w:hAnsi="Calibri"/>
+              <w:color w:val="1E293B"/>
+              <w:sz w:val="18"/>
+              <w:szCs w:val="18"/>
+            </w:rPr>
+            <w:t>Bank identifier code; used for distinct bank count calculation</w:t>
+          </w:r>
+        </w:p>
+      </w:tc>
+      <w:tc>
+        <w:tcPr>
+          <w:tcW w:w="2400" w:type="dxa"/>
+        </w:tcPr>
+        <w:p>
+          <w:pPr>
+            <w:spacing w:after="40" w:before="40" w:line="250"/>
+          </w:pPr>
+          <w:r>
+            <w:rPr>
+              <w:rFonts w:ascii="Courier New" w:cs="Courier New" w:eastAsia="Courier New" w:hAnsi="Courier New"/>
+              <w:color w:val="1E293B"/>
+              <w:sz w:val="18"/>
+              <w:szCs w:val="18"/>
+            </w:rPr>
+            <w:t>bankName</w:t>
+          </w:r>
+        </w:p>
+      </w:tc>
+      <w:tc>
+        <w:tcPr>
+          <w:tcW w:w="1600" w:type="dxa"/>
+        </w:tcPr>
+        <w:p>
+          <w:pPr>
+            <w:spacing w:after="40" w:before="40" w:line="250"/>
+          </w:pPr>
+          <w:r>
+            <w:rPr>
+              <w:rFonts w:ascii="Courier New" w:cs="Courier New" w:eastAsia="Courier New" w:hAnsi="Courier New"/>
+              <w:color w:val="1E293B"/>
+              <w:sz w:val="18"/>
+              <w:szCs w:val="18"/>
+            </w:rPr>
+            <w:t>String</w:t>
+          </w:r>
+        </w:p>
+      </w:tc>
+      <w:tc>
+        <w:tcPr>
+          <w:tcW w:w="5300" w:type="dxa"/>
+        </w:tcPr>
+        <w:p>
+          <w:pPr>
+            <w:spacing w:after="40" w:before="40" w:line="250"/>
+          </w:pPr>
+          <w:r>
+            <w:rPr>
+              <w:rFonts w:ascii="Calibri" w:cs="Calibri" w:eastAsia="Calibri" w:hAnsi="Calibri"/>
+              <w:color w:val="1E293B"/>
+              <w:sz w:val="18"/>
+              <w:szCs w:val="18"/>
+            </w:rPr>
+            <w:t>Bank display name</w:t>
+          </w:r>
+        </w:p>
+      </w:tc>
+      <w:tc>
+        <w:tcPr>
+          <w:tcW w:w="2400" w:type="dxa"/>
+        </w:tcPr>
+        <w:p>
+          <w:pPr>
+            <w:spacing w:after="40" w:before="40" w:line="250"/>
+          </w:pPr>
+          <w:r>
+            <w:rPr>
+              <w:rFonts w:ascii="Courier New" w:cs="Courier New" w:eastAsia="Courier New" w:hAnsi="Courier New"/>
+              <w:color w:val="1E293B"/>
+              <w:sz w:val="18"/>
+              <w:szCs w:val="18"/>
+            </w:rPr>
+            <w:t>accountNo</w:t>
+          </w:r>
+        </w:p>
+      </w:tc>
+      <w:tc>
+        <w:tcPr>
+          <w:tcW w:w="1600" w:type="dxa"/>
+        </w:tcPr>
+        <w:p>
+          <w:pPr>
+            <w:spacing w:after="40" w:before="40" w:line="250"/>
+          </w:pPr>
+          <w:r>
+            <w:rPr>
+              <w:rFonts w:ascii="Courier New" w:cs="Courier New" w:eastAsia="Courier New" w:hAnsi="Courier New"/>
+              <w:color w:val="1E293B"/>
+              <w:sz w:val="18"/>
+              <w:szCs w:val="18"/>
+            </w:rPr>
+            <w:t>String</w:t>
+          </w:r>
+        </w:p>
+      </w:tc>
+      <w:tc>
+        <w:tcPr>
+          <w:tcW w:w="5300" w:type="dxa"/>
+        </w:tcPr>
+        <w:p>
+          <w:pPr>
+            <w:spacing w:after="40" w:before="40" w:line="250"/>
+          </w:pPr>
+          <w:r>
+            <w:rPr>
+              <w:rFonts w:ascii="Calibri" w:cs="Calibri" w:eastAsia="Calibri" w:hAnsi="Calibri"/>
+              <w:color w:val="1E293B"/>
+              <w:sz w:val="18"/>
+              <w:szCs w:val="18"/>
+            </w:rPr>
+            <w:t>Loan account number</w:t>
+          </w:r>
+        </w:p>
+      </w:tc>
+      <w:tc>
+        <w:tcPr>
+          <w:tcW w:w="2400" w:type="dxa"/>
+        </w:tcPr>
+        <w:p>
+          <w:pPr>
+            <w:spacing w:after="40" w:before="40" w:line="250"/>
+          </w:pPr>
+          <w:r>
+            <w:rPr>
+              <w:rFonts w:ascii="Courier New" w:cs="Courier New" w:eastAsia="Courier New" w:hAnsi="Courier New"/>
+              <w:color w:val="1E293B"/>
+              <w:sz w:val="18"/>
+              <w:szCs w:val="18"/>
+            </w:rPr>
+            <w:t>creditType</w:t>
+          </w:r>
+        </w:p>
+      </w:tc>
+      <w:tc>
+        <w:tcPr>
+          <w:tcW w:w="1600" w:type="dxa"/>
+        </w:tcPr>
+        <w:p>
+          <w:pPr>
+            <w:spacing w:after="40" w:before="40" w:line="250"/>
+          </w:pPr>
+          <w:r>
+            <w:rPr>
+              <w:rFonts w:ascii="Courier New" w:cs="Courier New" w:eastAsia="Courier New" w:hAnsi="Courier New"/>
+              <w:color w:val="1E293B"/>
+              <w:sz w:val="18"/>
+              <w:szCs w:val="18"/>
+            </w:rPr>
+            <w:t>String</w:t>
+          </w:r>
+        </w:p>
+      </w:tc>
+      <w:tc>
+        <w:tcPr>
+          <w:tcW w:w="5300" w:type="dxa"/>
+        </w:tcPr>
+        <w:p>
+          <w:pPr>
+            <w:spacing w:after="40" w:before="40" w:line="250"/>
+          </w:pPr>
+          <w:r>
+            <w:rPr>
+              <w:rFonts w:ascii="Calibri" w:cs="Calibri" w:eastAsia="Calibri" w:hAnsi="Calibri"/>
+              <w:color w:val="1E293B"/>
+              <w:sz w:val="18"/>
+              <w:szCs w:val="18"/>
+            </w:rPr>
+            <w:t>Credit product type: 001=Loan, 002=Credit Line, 003=Credit Card, 004=Guarantee, 005=Overdraft, 006=Written-off, 007=Leasing, 008=Factoring, 010=Tranche</w:t>
+          </w:r>
+        </w:p>
+      </w:tc>
+      <w:tc>
+        <w:tcPr>
+          <w:tcW w:w="2400" w:type="dxa"/>
+        </w:tcPr>
+        <w:p>
+          <w:pPr>
+            <w:spacing w:after="40" w:before="40" w:line="250"/>
+          </w:pPr>
+          <w:r>
+            <w:rPr>
+              <w:rFonts w:ascii="Courier New" w:cs="Courier New" w:eastAsia="Courier New" w:hAnsi="Courier New"/>
+              <w:color w:val="1E293B"/>
+              <w:sz w:val="18"/>
+              <w:szCs w:val="18"/>
+            </w:rPr>
+            <w:t>creditTypeName</w:t>
+          </w:r>
+        </w:p>
+      </w:tc>
+      <w:tc>
+        <w:tcPr>
+          <w:tcW w:w="1600" w:type="dxa"/>
+        </w:tcPr>
+        <w:p>
+          <w:pPr>
+            <w:spacing w:after="40" w:before="40" w:line="250"/>
+          </w:pPr>
+          <w:r>
+            <w:rPr>
+              <w:rFonts w:ascii="Courier New" w:cs="Courier New" w:eastAsia="Courier New" w:hAnsi="Courier New"/>
+              <w:color w:val="1E293B"/>
+              <w:sz w:val="18"/>
+              <w:szCs w:val="18"/>
+            </w:rPr>
+            <w:t>String</w:t>
+          </w:r>
+        </w:p>
+      </w:tc>
+      <w:tc>
+        <w:tcPr>
+          <w:tcW w:w="5300" w:type="dxa"/>
+        </w:tcPr>
+        <w:p>
+          <w:pPr>
+            <w:spacing w:after="40" w:before="40" w:line="250"/>
+          </w:pPr>
+          <w:r>
+            <w:rPr>
+              <w:rFonts w:ascii="Calibri" w:cs="Calibri" w:eastAsia="Calibri" w:hAnsi="Calibri"/>
+              <w:color w:val="1E293B"/>
+              <w:sz w:val="18"/>
+              <w:szCs w:val="18"/>
+            </w:rPr>
+            <w:t>Human-readable credit type name (localized)</w:t>
+          </w:r>
+        </w:p>
+      </w:tc>
+      <w:tc>
+        <w:tcPr>
+          <w:tcW w:w="2400" w:type="dxa"/>
+        </w:tcPr>
+        <w:p>
+          <w:pPr>
+            <w:spacing w:after="40" w:before="40" w:line="250"/>
+          </w:pPr>
+          <w:r>
+            <w:rPr>
+              <w:rFonts w:ascii="Courier New" w:cs="Courier New" w:eastAsia="Courier New" w:hAnsi="Courier New"/>
+              <w:color w:val="1E293B"/>
+              <w:sz w:val="18"/>
+              <w:szCs w:val="18"/>
+            </w:rPr>
+            <w:t>orgIDType</w:t>
+          </w:r>
+        </w:p>
+      </w:tc>
+      <w:tc>
+        <w:tcPr>
+          <w:tcW w:w="1600" w:type="dxa"/>
+        </w:tcPr>
+        <w:p>
+          <w:pPr>
+            <w:spacing w:after="40" w:before="40" w:line="250"/>
+          </w:pPr>
+          <w:r>
+            <w:rPr>
+              <w:rFonts w:ascii="Courier New" w:cs="Courier New" w:eastAsia="Courier New" w:hAnsi="Courier New"/>
+              <w:color w:val="1E293B"/>
+              <w:sz w:val="18"/>
+              <w:szCs w:val="18"/>
+            </w:rPr>
+            <w:t>String</w:t>
+          </w:r>
+        </w:p>
+      </w:tc>
+      <w:tc>
+        <w:tcPr>
+          <w:tcW w:w="5300" w:type="dxa"/>
+        </w:tcPr>
+        <w:p>
+          <w:pPr>
+            <w:spacing w:after="40" w:before="40" w:line="250"/>
+          </w:pPr>
+          <w:r>
+            <w:rPr>
+              <w:rFonts w:ascii="Calibri" w:cs="Calibri" w:eastAsia="Calibri" w:hAnsi="Calibri"/>
+              <w:color w:val="1E293B"/>
+              <w:sz w:val="18"/>
+              <w:szCs w:val="18"/>
+            </w:rPr>
+            <w:t>Organization ID type (lending org identifier)</w:t>
+          </w:r>
+        </w:p>
+      </w:tc>
+      <w:tc>
+        <w:tcPr>
+          <w:tcW w:w="2400" w:type="dxa"/>
+        </w:tcPr>
+        <w:p>
+          <w:pPr>
+            <w:spacing w:after="40" w:before="40" w:line="250"/>
+          </w:pPr>
+          <w:r>
+            <w:rPr>
+              <w:rFonts w:ascii="Courier New" w:cs="Courier New" w:eastAsia="Courier New" w:hAnsi="Courier New"/>
+              <w:color w:val="1E293B"/>
+              <w:sz w:val="18"/>
+              <w:szCs w:val="18"/>
+            </w:rPr>
+            <w:t>grantedOn</w:t>
+          </w:r>
+        </w:p>
+      </w:tc>
+      <w:tc>
+        <w:tcPr>
+          <w:tcW w:w="1600" w:type="dxa"/>
+        </w:tcPr>
+        <w:p>
+          <w:pPr>
+            <w:spacing w:after="40" w:before="40" w:line="250"/>
+          </w:pPr>
+          <w:r>
+            <w:rPr>
+              <w:rFonts w:ascii="Courier New" w:cs="Courier New" w:eastAsia="Courier New" w:hAnsi="Courier New"/>
+              <w:color w:val="1E293B"/>
+              <w:sz w:val="18"/>
+              <w:szCs w:val="18"/>
+            </w:rPr>
+            <w:t>dateTime</w:t>
+          </w:r>
+        </w:p>
+      </w:tc>
+      <w:tc>
+        <w:tcPr>
+          <w:tcW w:w="5300" w:type="dxa"/>
+        </w:tcPr>
+        <w:p>
+          <w:pPr>
+            <w:spacing w:after="40" w:before="40" w:line="250"/>
+          </w:pPr>
+          <w:r>
+            <w:rPr>
+              <w:rFonts w:ascii="Calibri" w:cs="Calibri" w:eastAsia="Calibri" w:hAnsi="Calibri"/>
+              <w:color w:val="1E293B"/>
+              <w:sz w:val="18"/>
+              <w:szCs w:val="18"/>
+            </w:rPr>
+            <w:t>Disbursement/granting date; used for months remaining and history timeline</w:t>
+          </w:r>
+        </w:p>
+      </w:tc>
+      <w:tc>
+        <w:tcPr>
+          <w:tcW w:w="2400" w:type="dxa"/>
+        </w:tcPr>
+        <w:p>
+          <w:pPr>
+            <w:spacing w:after="40" w:before="40" w:line="250"/>
+          </w:pPr>
+          <w:r>
+            <w:rPr>
+              <w:rFonts w:ascii="Courier New" w:cs="Courier New" w:eastAsia="Courier New" w:hAnsi="Courier New"/>
+              <w:color w:val="1E293B"/>
+              <w:sz w:val="18"/>
+              <w:szCs w:val="18"/>
+            </w:rPr>
+            <w:t>initialAmount</w:t>
+          </w:r>
+        </w:p>
+      </w:tc>
+      <w:tc>
+        <w:tcPr>
+          <w:tcW w:w="1600" w:type="dxa"/>
+        </w:tcPr>
+        <w:p>
+          <w:pPr>
+            <w:spacing w:after="40" w:before="40" w:line="250"/>
+          </w:pPr>
+          <w:r>
+            <w:rPr>
+              <w:rFonts w:ascii="Courier New" w:cs="Courier New" w:eastAsia="Courier New" w:hAnsi="Courier New"/>
+              <w:color w:val="1E293B"/>
+              <w:sz w:val="18"/>
+              <w:szCs w:val="18"/>
+            </w:rPr>
+            <w:t>BigDecimal</w:t>
+          </w:r>
+        </w:p>
+      </w:tc>
+      <w:tc>
+        <w:tcPr>
+          <w:tcW w:w="5300" w:type="dxa"/>
+        </w:tcPr>
+        <w:p>
+          <w:pPr>
+            <w:spacing w:after="40" w:before="40" w:line="250"/>
+          </w:pPr>
+          <w:r>
+            <w:rPr>
+              <w:rFonts w:ascii="Calibri" w:cs="Calibri" w:eastAsia="Calibri" w:hAnsi="Calibri"/>
+              <w:color w:val="1E293B"/>
+              <w:sz w:val="18"/>
+              <w:szCs w:val="18"/>
+            </w:rPr>
+            <w:t>Original loan amount granted</w:t>
+          </w:r>
+        </w:p>
+      </w:tc>
+      <w:tc>
+        <w:tcPr>
+          <w:tcW w:w="2400" w:type="dxa"/>
+        </w:tcPr>
+        <w:p>
+          <w:pPr>
+            <w:spacing w:after="40" w:before="40" w:line="250"/>
+          </w:pPr>
+          <w:r>
+            <w:rPr>
+              <w:rFonts w:ascii="Courier New" w:cs="Courier New" w:eastAsia="Courier New" w:hAnsi="Courier New"/>
+              <w:color w:val="1E293B"/>
+              <w:sz w:val="18"/>
+              <w:szCs w:val="18"/>
+            </w:rPr>
+            <w:t>lineAmount</w:t>
+          </w:r>
+        </w:p>
+      </w:tc>
+      <w:tc>
+        <w:tcPr>
+          <w:tcW w:w="1600" w:type="dxa"/>
+        </w:tcPr>
+        <w:p>
+          <w:pPr>
+            <w:spacing w:after="40" w:before="40" w:line="250"/>
+          </w:pPr>
+          <w:r>
+            <w:rPr>
+              <w:rFonts w:ascii="Courier New" w:cs="Courier New" w:eastAsia="Courier New" w:hAnsi="Courier New"/>
+              <w:color w:val="1E293B"/>
+              <w:sz w:val="18"/>
+              <w:szCs w:val="18"/>
+            </w:rPr>
+            <w:t>BigDecimal</w:t>
+          </w:r>
+        </w:p>
+      </w:tc>
+      <w:tc>
+        <w:tcPr>
+          <w:tcW w:w="5300" w:type="dxa"/>
+        </w:tcPr>
+        <w:p>
+          <w:pPr>
+            <w:spacing w:after="40" w:before="40" w:line="250"/>
+          </w:pPr>
+          <w:r>
+            <w:rPr>
+              <w:rFonts w:ascii="Calibri" w:cs="Calibri" w:eastAsia="Calibri" w:hAnsi="Calibri"/>
+              <w:color w:val="1E293B"/>
+              <w:sz w:val="18"/>
+              <w:szCs w:val="18"/>
+            </w:rPr>
+            <w:t>Credit line limit amount; used for utilization % calculations</w:t>
+          </w:r>
+        </w:p>
+      </w:tc>
+      <w:tc>
+        <w:tcPr>
+          <w:tcW w:w="2400" w:type="dxa"/>
+        </w:tcPr>
+        <w:p>
+          <w:pPr>
+            <w:spacing w:after="40" w:before="40" w:line="250"/>
+          </w:pPr>
+          <w:r>
+            <w:rPr>
+              <w:rFonts w:ascii="Courier New" w:cs="Courier New" w:eastAsia="Courier New" w:hAnsi="Courier New"/>
+              <w:color w:val="1E293B"/>
+              <w:sz w:val="18"/>
+              <w:szCs w:val="18"/>
+            </w:rPr>
+            <w:t>daysInterestOverdue</w:t>
+          </w:r>
+        </w:p>
+      </w:tc>
+      <w:tc>
+        <w:tcPr>
+          <w:tcW w:w="1600" w:type="dxa"/>
+        </w:tcPr>
+        <w:p>
+          <w:pPr>
+            <w:spacing w:after="40" w:before="40" w:line="250"/>
+          </w:pPr>
+          <w:r>
+            <w:rPr>
+              <w:rFonts w:ascii="Courier New" w:cs="Courier New" w:eastAsia="Courier New" w:hAnsi="Courier New"/>
+              <w:color w:val="1E293B"/>
+              <w:sz w:val="18"/>
+              <w:szCs w:val="18"/>
+            </w:rPr>
+            <w:t>Long</w:t>
+          </w:r>
+        </w:p>
+      </w:tc>
+      <w:tc>
+        <w:tcPr>
+          <w:tcW w:w="5300" w:type="dxa"/>
+        </w:tcPr>
+        <w:p>
+          <w:pPr>
+            <w:spacing w:after="40" w:before="40" w:line="250"/>
+          </w:pPr>
+          <w:r>
+            <w:rPr>
+              <w:rFonts w:ascii="Calibri" w:cs="Calibri" w:eastAsia="Calibri" w:hAnsi="Calibri"/>
+              <w:color w:val="1E293B"/>
+              <w:sz w:val="18"/>
+              <w:szCs w:val="18"/>
+            </w:rPr>
+            <w:t>Number of days interest payment is overdue</w:t>
+          </w:r>
+        </w:p>
+      </w:tc>
+      <w:tc>
+        <w:tcPr>
+          <w:tcW w:w="2400" w:type="dxa"/>
+        </w:tcPr>
+        <w:p>
+          <w:pPr>
+            <w:spacing w:after="40" w:before="40" w:line="250"/>
+          </w:pPr>
+          <w:r>
+            <w:rPr>
+              <w:rFonts w:ascii="Courier New" w:cs="Courier New" w:eastAsia="Courier New" w:hAnsi="Courier New"/>
+              <w:color w:val="1E293B"/>
+              <w:sz w:val="18"/>
+              <w:szCs w:val="18"/>
+            </w:rPr>
+            <w:t>daysMainSumOverdue</w:t>
+          </w:r>
+        </w:p>
+      </w:tc>
+      <w:tc>
+        <w:tcPr>
+          <w:tcW w:w="1600" w:type="dxa"/>
+        </w:tcPr>
+        <w:p>
+          <w:pPr>
+            <w:spacing w:after="40" w:before="40" w:line="250"/>
+          </w:pPr>
+          <w:r>
+            <w:rPr>
+              <w:rFonts w:ascii="Courier New" w:cs="Courier New" w:eastAsia="Courier New" w:hAnsi="Courier New"/>
+              <w:color w:val="1E293B"/>
+              <w:sz w:val="18"/>
+              <w:szCs w:val="18"/>
+            </w:rPr>
+            <w:t>Long</w:t>
+          </w:r>
+        </w:p>
+      </w:tc>
+      <w:tc>
+        <w:tcPr>
+          <w:tcW w:w="5300" w:type="dxa"/>
+        </w:tcPr>
+        <w:p>
+          <w:pPr>
+            <w:spacing w:after="40" w:before="40" w:line="250"/>
+          </w:pPr>
+          <w:r>
+            <w:rPr>
+              <w:rFonts w:ascii="Calibri" w:cs="Calibri" w:eastAsia="Calibri" w:hAnsi="Calibri"/>
+              <w:color w:val="1E293B"/>
+              <w:sz w:val="18"/>
+              <w:szCs w:val="18"/>
+            </w:rPr>
+            <w:t>Number of days principal payment overdue; used in MKR indicator 28</w:t>
+          </w:r>
+        </w:p>
+      </w:tc>
+      <w:tc>
+        <w:tcPr>
+          <w:tcW w:w="2400" w:type="dxa"/>
+        </w:tcPr>
+        <w:p>
+          <w:pPr>
+            <w:spacing w:after="40" w:before="40" w:line="250"/>
+          </w:pPr>
+          <w:r>
+            <w:rPr>
+              <w:rFonts w:ascii="Courier New" w:cs="Courier New" w:eastAsia="Courier New" w:hAnsi="Courier New"/>
+              <w:color w:val="1E293B"/>
+              <w:sz w:val="18"/>
+              <w:szCs w:val="18"/>
+            </w:rPr>
+            <w:t>contractDueOn</w:t>
+          </w:r>
+        </w:p>
+      </w:tc>
+      <w:tc>
+        <w:tcPr>
+          <w:tcW w:w="1600" w:type="dxa"/>
+        </w:tcPr>
+        <w:p>
+          <w:pPr>
+            <w:spacing w:after="40" w:before="40" w:line="250"/>
+          </w:pPr>
+          <w:r>
+            <w:rPr>
+              <w:rFonts w:ascii="Courier New" w:cs="Courier New" w:eastAsia="Courier New" w:hAnsi="Courier New"/>
+              <w:color w:val="1E293B"/>
+              <w:sz w:val="18"/>
+              <w:szCs w:val="18"/>
+            </w:rPr>
+            <w:t>dateTime</w:t>
+          </w:r>
+        </w:p>
+      </w:tc>
+      <w:tc>
+        <w:tcPr>
+          <w:tcW w:w="5300" w:type="dxa"/>
+        </w:tcPr>
+        <w:p>
+          <w:pPr>
+            <w:spacing w:after="40" w:before="40" w:line="250"/>
+          </w:pPr>
+          <w:r>
+            <w:rPr>
+              <w:rFonts w:ascii="Calibri" w:cs="Calibri" w:eastAsia="Calibri" w:hAnsi="Calibri"/>
+              <w:color w:val="1E293B"/>
+              <w:sz w:val="18"/>
+              <w:szCs w:val="18"/>
+            </w:rPr>
+            <w:t>Contract maturity/end date; used to calculate months remaining</w:t>
+          </w:r>
+        </w:p>
+      </w:tc>
+      <w:tc>
+        <w:tcPr>
+          <w:tcW w:w="2400" w:type="dxa"/>
+        </w:tcPr>
+        <w:p>
+          <w:pPr>
+            <w:spacing w:after="40" w:before="40" w:line="250"/>
+          </w:pPr>
+          <w:r>
+            <w:rPr>
+              <w:rFonts w:ascii="Courier New" w:cs="Courier New" w:eastAsia="Courier New" w:hAnsi="Courier New"/>
+              <w:color w:val="1E293B"/>
+              <w:sz w:val="18"/>
+              <w:szCs w:val="18"/>
+            </w:rPr>
+            <w:t>interestRate</w:t>
+          </w:r>
+        </w:p>
+      </w:tc>
+      <w:tc>
+        <w:tcPr>
+          <w:tcW w:w="1600" w:type="dxa"/>
+        </w:tcPr>
+        <w:p>
+          <w:pPr>
+            <w:spacing w:after="40" w:before="40" w:line="250"/>
+          </w:pPr>
+          <w:r>
+            <w:rPr>
+              <w:rFonts w:ascii="Courier New" w:cs="Courier New" w:eastAsia="Courier New" w:hAnsi="Courier New"/>
+              <w:color w:val="1E293B"/>
+              <w:sz w:val="18"/>
+              <w:szCs w:val="18"/>
+            </w:rPr>
+            <w:t>BigDecimal</w:t>
+          </w:r>
+        </w:p>
+      </w:tc>
+      <w:tc>
+        <w:tcPr>
+          <w:tcW w:w="5300" w:type="dxa"/>
+        </w:tcPr>
+        <w:p>
+          <w:pPr>
+            <w:spacing w:after="40" w:before="40" w:line="250"/>
+          </w:pPr>
+          <w:r>
+            <w:rPr>
+              <w:rFonts w:ascii="Calibri" w:cs="Calibri" w:eastAsia="Calibri" w:hAnsi="Calibri"/>
+              <w:color w:val="1E293B"/>
+              <w:sz w:val="18"/>
+              <w:szCs w:val="18"/>
+            </w:rPr>
+            <w:t>Annual interest rate (%); used to detect payday loans (rate &amp;gt; 55%)</w:t>
+          </w:r>
+        </w:p>
+      </w:tc>
+      <w:tc>
+        <w:tcPr>
+          <w:tcW w:w="2400" w:type="dxa"/>
+        </w:tcPr>
+        <w:p>
+          <w:pPr>
+            <w:spacing w:after="40" w:before="40" w:line="250"/>
+          </w:pPr>
+          <w:r>
+            <w:rPr>
+              <w:rFonts w:ascii="Courier New" w:cs="Courier New" w:eastAsia="Courier New" w:hAnsi="Courier New"/>
+              <w:color w:val="1E293B"/>
+              <w:sz w:val="18"/>
+              <w:szCs w:val="18"/>
+            </w:rPr>
+            <w:t>lastUpdatedDate</w:t>
+          </w:r>
+        </w:p>
+      </w:tc>
+      <w:tc>
+        <w:tcPr>
+          <w:tcW w:w="1600" w:type="dxa"/>
+        </w:tcPr>
+        <w:p>
+          <w:pPr>
+            <w:spacing w:after="40" w:before="40" w:line="250"/>
+          </w:pPr>
+          <w:r>
+            <w:rPr>
+              <w:rFonts w:ascii="Courier New" w:cs="Courier New" w:eastAsia="Courier New" w:hAnsi="Courier New"/>
+              <w:color w:val="1E293B"/>
+              <w:sz w:val="18"/>
+              <w:szCs w:val="18"/>
+            </w:rPr>
+            <w:t>dateTime</w:t>
+          </w:r>
+        </w:p>
+      </w:tc>
+      <w:tc>
+        <w:tcPr>
+          <w:tcW w:w="5300" w:type="dxa"/>
+        </w:tcPr>
+        <w:p>
+          <w:pPr>
+            <w:spacing w:after="40" w:before="40" w:line="250"/>
+          </w:pPr>
+          <w:r>
+            <w:rPr>
+              <w:rFonts w:ascii="Calibri" w:cs="Calibri" w:eastAsia="Calibri" w:hAnsi="Calibri"/>
+              <w:color w:val="1E293B"/>
+              <w:sz w:val="18"/>
+              <w:szCs w:val="18"/>
+            </w:rPr>
+            <w:t>Date of last data update from credit bureau</w:t>
+          </w:r>
+        </w:p>
+      </w:tc>
+      <w:tc>
+        <w:tcPr>
+          <w:tcW w:w="2400" w:type="dxa"/>
+        </w:tcPr>
+        <w:p>
+          <w:pPr>
+            <w:spacing w:after="40" w:before="40" w:line="250"/>
+          </w:pPr>
+          <w:r>
+            <w:rPr>
+              <w:rFonts w:ascii="Courier New" w:cs="Courier New" w:eastAsia="Courier New" w:hAnsi="Courier New"/>
+              <w:color w:val="1E293B"/>
+              <w:sz w:val="18"/>
+              <w:szCs w:val="18"/>
+            </w:rPr>
+            <w:t>lastPaymentDate</w:t>
+          </w:r>
+        </w:p>
+      </w:tc>
+      <w:tc>
+        <w:tcPr>
+          <w:tcW w:w="1600" w:type="dxa"/>
+        </w:tcPr>
+        <w:p>
+          <w:pPr>
+            <w:spacing w:after="40" w:before="40" w:line="250"/>
+          </w:pPr>
+          <w:r>
+            <w:rPr>
+              <w:rFonts w:ascii="Courier New" w:cs="Courier New" w:eastAsia="Courier New" w:hAnsi="Courier New"/>
+              <w:color w:val="1E293B"/>
+              <w:sz w:val="18"/>
+              <w:szCs w:val="18"/>
+            </w:rPr>
+            <w:t>dateTime</w:t>
+          </w:r>
+        </w:p>
+      </w:tc>
+      <w:tc>
+        <w:tcPr>
+          <w:tcW w:w="5300" w:type="dxa"/>
+        </w:tcPr>
+        <w:p>
+          <w:pPr>
+            <w:spacing w:after="40" w:before="40" w:line="250"/>
+          </w:pPr>
+          <w:r>
+            <w:rPr>
+              <w:rFonts w:ascii="Calibri" w:cs="Calibri" w:eastAsia="Calibri" w:hAnsi="Calibri"/>
+              <w:color w:val="1E293B"/>
+              <w:sz w:val="18"/>
+              <w:szCs w:val="18"/>
+            </w:rPr>
+            <w:t>Date of last payment made</w:t>
+          </w:r>
+        </w:p>
+      </w:tc>
+      <w:tc>
+        <w:tcPr>
+          <w:tcW w:w="2400" w:type="dxa"/>
+        </w:tcPr>
+        <w:p>
+          <w:pPr>
+            <w:spacing w:after="40" w:before="40" w:line="250"/>
+          </w:pPr>
+          <w:r>
+            <w:rPr>
+              <w:rFonts w:ascii="Courier New" w:cs="Courier New" w:eastAsia="Courier New" w:hAnsi="Courier New"/>
+              <w:color w:val="1E293B"/>
+              <w:sz w:val="18"/>
+              <w:szCs w:val="18"/>
+            </w:rPr>
+            <w:t>outstandingDebtMain</w:t>
+          </w:r>
+        </w:p>
+      </w:tc>
+      <w:tc>
+        <w:tcPr>
+          <w:tcW w:w="1600" w:type="dxa"/>
+        </w:tcPr>
+        <w:p>
+          <w:pPr>
+            <w:spacing w:after="40" w:before="40" w:line="250"/>
+          </w:pPr>
+          <w:r>
+            <w:rPr>
+              <w:rFonts w:ascii="Courier New" w:cs="Courier New" w:eastAsia="Courier New" w:hAnsi="Courier New"/>
+              <w:color w:val="1E293B"/>
+              <w:sz w:val="18"/>
+              <w:szCs w:val="18"/>
+            </w:rPr>
+            <w:t>BigDecimal</w:t>
+          </w:r>
+        </w:p>
+      </w:tc>
+      <w:tc>
+        <w:tcPr>
+          <w:tcW w:w="5300" w:type="dxa"/>
+        </w:tcPr>
+        <w:p>
+          <w:pPr>
+            <w:spacing w:after="40" w:before="40" w:line="250"/>
+          </w:pPr>
+          <w:r>
+            <w:rPr>
+              <w:rFonts w:ascii="Calibri" w:cs="Calibri" w:eastAsia="Calibri" w:hAnsi="Calibri"/>
+              <w:color w:val="1E293B"/>
+              <w:sz w:val="18"/>
+              <w:szCs w:val="18"/>
+            </w:rPr>
+            <w:t>Outstanding principal balance; core field for total debt and DTI computation</w:t>
+          </w:r>
+        </w:p>
+      </w:tc>
+      <w:tc>
+        <w:tcPr>
+          <w:tcW w:w="2400" w:type="dxa"/>
+        </w:tcPr>
+        <w:p>
+          <w:pPr>
+            <w:spacing w:after="40" w:before="40" w:line="250"/>
+          </w:pPr>
+          <w:r>
+            <w:rPr>
+              <w:rFonts w:ascii="Courier New" w:cs="Courier New" w:eastAsia="Courier New" w:hAnsi="Courier New"/>
+              <w:color w:val="1E293B"/>
+              <w:sz w:val="18"/>
+              <w:szCs w:val="18"/>
+            </w:rPr>
+            <w:t>outstandingDebtInterest</w:t>
+          </w:r>
+        </w:p>
+      </w:tc>
+      <w:tc>
+        <w:tcPr>
+          <w:tcW w:w="1600" w:type="dxa"/>
+        </w:tcPr>
+        <w:p>
+          <w:pPr>
+            <w:spacing w:after="40" w:before="40" w:line="250"/>
+          </w:pPr>
+          <w:r>
+            <w:rPr>
+              <w:rFonts w:ascii="Courier New" w:cs="Courier New" w:eastAsia="Courier New" w:hAnsi="Courier New"/>
+              <w:color w:val="1E293B"/>
+              <w:sz w:val="18"/>
+              <w:szCs w:val="18"/>
+            </w:rPr>
+            <w:t>BigDecimal</w:t>
+          </w:r>
+        </w:p>
+      </w:tc>
+      <w:tc>
+        <w:tcPr>
+          <w:tcW w:w="5300" w:type="dxa"/>
+        </w:tcPr>
+        <w:p>
+          <w:pPr>
+            <w:spacing w:after="40" w:before="40" w:line="250"/>
+          </w:pPr>
+          <w:r>
+            <w:rPr>
+              <w:rFonts w:ascii="Calibri" w:cs="Calibri" w:eastAsia="Calibri" w:hAnsi="Calibri"/>
+              <w:color w:val="1E293B"/>
+              <w:sz w:val="18"/>
+              <w:szCs w:val="18"/>
+            </w:rPr>
+            <w:t>Outstanding interest balance</w:t>
+          </w:r>
+        </w:p>
+      </w:tc>
+      <w:tc>
+        <w:tcPr>
+          <w:tcW w:w="2400" w:type="dxa"/>
+        </w:tcPr>
+        <w:p>
+          <w:pPr>
+            <w:spacing w:after="40" w:before="40" w:line="250"/>
+          </w:pPr>
+          <w:r>
+            <w:rPr>
+              <w:rFonts w:ascii="Courier New" w:cs="Courier New" w:eastAsia="Courier New" w:hAnsi="Courier New"/>
+              <w:color w:val="1E293B"/>
+              <w:sz w:val="18"/>
+              <w:szCs w:val="18"/>
+            </w:rPr>
+            <w:t>monthlyPaymentAmount</w:t>
+          </w:r>
+        </w:p>
+      </w:tc>
+      <w:tc>
+        <w:tcPr>
+          <w:tcW w:w="1600" w:type="dxa"/>
+        </w:tcPr>
+        <w:p>
+          <w:pPr>
+            <w:spacing w:after="40" w:before="40" w:line="250"/>
+          </w:pPr>
+          <w:r>
+            <w:rPr>
+              <w:rFonts w:ascii="Courier New" w:cs="Courier New" w:eastAsia="Courier New" w:hAnsi="Courier New"/>
+              <w:color w:val="1E293B"/>
+              <w:sz w:val="18"/>
+              <w:szCs w:val="18"/>
+            </w:rPr>
+            <w:t>BigDecimal</w:t>
+          </w:r>
+        </w:p>
+      </w:tc>
+      <w:tc>
+        <w:tcPr>
+          <w:tcW w:w="5300" w:type="dxa"/>
+        </w:tcPr>
+        <w:p>
+          <w:pPr>
+            <w:spacing w:after="40" w:before="40" w:line="250"/>
+          </w:pPr>
+          <w:r>
+            <w:rPr>
+              <w:rFonts w:ascii="Calibri" w:cs="Calibri" w:eastAsia="Calibri" w:hAnsi="Calibri"/>
+              <w:color w:val="1E293B"/>
+              <w:sz w:val="18"/>
+              <w:szCs w:val="18"/>
+            </w:rPr>
+            <w:t>Monthly payment obligation; if nil/0, calculated via annuity formula by Clojure</w:t>
+          </w:r>
+        </w:p>
+      </w:tc>
+      <w:tc>
+        <w:tcPr>
+          <w:tcW w:w="2400" w:type="dxa"/>
+        </w:tcPr>
+        <w:p>
+          <w:pPr>
+            <w:spacing w:after="40" w:before="40" w:line="250"/>
+          </w:pPr>
+          <w:r>
+            <w:rPr>
+              <w:rFonts w:ascii="Courier New" w:cs="Courier New" w:eastAsia="Courier New" w:hAnsi="Courier New"/>
+              <w:color w:val="1E293B"/>
+              <w:sz w:val="18"/>
+              <w:szCs w:val="18"/>
+            </w:rPr>
+            <w:t>prolongations</w:t>
+          </w:r>
+        </w:p>
+      </w:tc>
+      <w:tc>
+        <w:tcPr>
+          <w:tcW w:w="1600" w:type="dxa"/>
+        </w:tcPr>
+        <w:p>
+          <w:pPr>
+            <w:spacing w:after="40" w:before="40" w:line="250"/>
+          </w:pPr>
+          <w:r>
+            <w:rPr>
+              <w:rFonts w:ascii="Courier New" w:cs="Courier New" w:eastAsia="Courier New" w:hAnsi="Courier New"/>
+              <w:color w:val="1E293B"/>
+              <w:sz w:val="18"/>
+              <w:szCs w:val="18"/>
+            </w:rPr>
+            <w:t>Long</w:t>
+          </w:r>
+        </w:p>
+      </w:tc>
+      <w:tc>
+        <w:tcPr>
+          <w:tcW w:w="5300" w:type="dxa"/>
+        </w:tcPr>
+        <w:p>
+          <w:pPr>
+            <w:spacing w:after="40" w:before="40" w:line="250"/>
+          </w:pPr>
+          <w:r>
+            <w:rPr>
+              <w:rFonts w:ascii="Calibri" w:cs="Calibri" w:eastAsia="Calibri" w:hAnsi="Calibri"/>
+              <w:color w:val="1E293B"/>
+              <w:sz w:val="18"/>
+              <w:szCs w:val="18"/>
+            </w:rPr>
+            <w:t>Number of loan prolongation/extension events</w:t>
+          </w:r>
+        </w:p>
+      </w:tc>
+      <w:tc>
+        <w:tcPr>
+          <w:tcW w:w="2400" w:type="dxa"/>
+        </w:tcPr>
+        <w:p>
+          <w:pPr>
+            <w:spacing w:after="40" w:before="40" w:line="250"/>
+          </w:pPr>
+          <w:r>
+            <w:rPr>
+              <w:rFonts w:ascii="Courier New" w:cs="Courier New" w:eastAsia="Courier New" w:hAnsi="Courier New"/>
+              <w:color w:val="1E293B"/>
+              <w:sz w:val="18"/>
+              <w:szCs w:val="18"/>
+            </w:rPr>
+            <w:t>creditStatus</w:t>
+          </w:r>
+        </w:p>
+      </w:tc>
+      <w:tc>
+        <w:tcPr>
+          <w:tcW w:w="1600" w:type="dxa"/>
+        </w:tcPr>
+        <w:p>
+          <w:pPr>
+            <w:spacing w:after="40" w:before="40" w:line="250"/>
+          </w:pPr>
+          <w:r>
+            <w:rPr>
+              <w:rFonts w:ascii="Courier New" w:cs="Courier New" w:eastAsia="Courier New" w:hAnsi="Courier New"/>
+              <w:color w:val="1E293B"/>
+              <w:sz w:val="18"/>
+              <w:szCs w:val="18"/>
+            </w:rPr>
+            <w:t>String</w:t>
+          </w:r>
+        </w:p>
+      </w:tc>
+      <w:tc>
+        <w:tcPr>
+          <w:tcW w:w="5300" w:type="dxa"/>
+        </w:tcPr>
+        <w:p>
+          <w:pPr>
+            <w:spacing w:after="40" w:before="40" w:line="250"/>
+          </w:pPr>
+          <w:r>
+            <w:rPr>
+              <w:rFonts w:ascii="Calibri" w:cs="Calibri" w:eastAsia="Calibri" w:hAnsi="Calibri"/>
+              <w:color w:val="1E293B"/>
+              <w:sz w:val="18"/>
+              <w:szCs w:val="18"/>
+            </w:rPr>
+            <w:t>Credit status: 001=Fully Paid, 002-009=Active, 011=Claim Transferred</w:t>
+          </w:r>
+        </w:p>
+      </w:tc>
+      <w:tc>
+        <w:tcPr>
+          <w:tcW w:w="2400" w:type="dxa"/>
+        </w:tcPr>
+        <w:p>
+          <w:pPr>
+            <w:spacing w:after="40" w:before="40" w:line="250"/>
+          </w:pPr>
+          <w:r>
+            <w:rPr>
+              <w:rFonts w:ascii="Courier New" w:cs="Courier New" w:eastAsia="Courier New" w:hAnsi="Courier New"/>
+              <w:color w:val="1E293B"/>
+              <w:sz w:val="18"/>
+              <w:szCs w:val="18"/>
+            </w:rPr>
+            <w:t>creditStatusName</w:t>
+          </w:r>
+        </w:p>
+      </w:tc>
+      <w:tc>
+        <w:tcPr>
+          <w:tcW w:w="1600" w:type="dxa"/>
+        </w:tcPr>
+        <w:p>
+          <w:pPr>
+            <w:spacing w:after="40" w:before="40" w:line="250"/>
+          </w:pPr>
+          <w:r>
+            <w:rPr>
+              <w:rFonts w:ascii="Courier New" w:cs="Courier New" w:eastAsia="Courier New" w:hAnsi="Courier New"/>
+              <w:color w:val="1E293B"/>
+              <w:sz w:val="18"/>
+              <w:szCs w:val="18"/>
+            </w:rPr>
+            <w:t>String</w:t>
+          </w:r>
+        </w:p>
+      </w:tc>
+      <w:tc>
+        <w:tcPr>
+          <w:tcW w:w="5300" w:type="dxa"/>
+        </w:tcPr>
+        <w:p>
+          <w:pPr>
+            <w:spacing w:after="40" w:before="40" w:line="250"/>
+          </w:pPr>
+          <w:r>
+            <w:rPr>
+              <w:rFonts w:ascii="Calibri" w:cs="Calibri" w:eastAsia="Calibri" w:hAnsi="Calibri"/>
+              <w:color w:val="1E293B"/>
+              <w:sz w:val="18"/>
+              <w:szCs w:val="18"/>
+            </w:rPr>
+            <w:t>Human-readable credit status name (localized)</w:t>
+          </w:r>
+        </w:p>
+      </w:tc>
+      <w:tc>
+        <w:tcPr>
+          <w:tcW w:w="2400" w:type="dxa"/>
+        </w:tcPr>
+        <w:p>
+          <w:pPr>
+            <w:spacing w:after="40" w:before="40" w:line="250"/>
+          </w:pPr>
+          <w:r>
+            <w:rPr>
+              <w:rFonts w:ascii="Courier New" w:cs="Courier New" w:eastAsia="Courier New" w:hAnsi="Courier New"/>
+              <w:color w:val="1E293B"/>
+              <w:sz w:val="18"/>
+              <w:szCs w:val="18"/>
+            </w:rPr>
+            <w:t>creditStatusCloseDate</w:t>
+          </w:r>
+        </w:p>
+      </w:tc>
+      <w:tc>
+        <w:tcPr>
+          <w:tcW w:w="1600" w:type="dxa"/>
+        </w:tcPr>
+        <w:p>
+          <w:pPr>
+            <w:spacing w:after="40" w:before="40" w:line="250"/>
+          </w:pPr>
+          <w:r>
+            <w:rPr>
+              <w:rFonts w:ascii="Courier New" w:cs="Courier New" w:eastAsia="Courier New" w:hAnsi="Courier New"/>
+              <w:color w:val="1E293B"/>
+              <w:sz w:val="18"/>
+              <w:szCs w:val="18"/>
+            </w:rPr>
+            <w:t>dateTime</w:t>
+          </w:r>
+        </w:p>
+      </w:tc>
+      <w:tc>
+        <w:tcPr>
+          <w:tcW w:w="5300" w:type="dxa"/>
+        </w:tcPr>
+        <w:p>
+          <w:pPr>
+            <w:spacing w:after="40" w:before="40" w:line="250"/>
+          </w:pPr>
+          <w:r>
+            <w:rPr>
+              <w:rFonts w:ascii="Calibri" w:cs="Calibri" w:eastAsia="Calibri" w:hAnsi="Calibri"/>
+              <w:color w:val="1E293B"/>
+              <w:sz w:val="18"/>
+              <w:szCs w:val="18"/>
+            </w:rPr>
+            <w:t>Date when credit was closed; NULL = still active</w:t>
+          </w:r>
+        </w:p>
+      </w:tc>
+      <w:tc>
+        <w:tcPr>
+          <w:tcW w:w="2400" w:type="dxa"/>
+        </w:tcPr>
+        <w:p>
+          <w:pPr>
+            <w:spacing w:after="40" w:before="40" w:line="250"/>
+          </w:pPr>
+          <w:r>
+            <w:rPr>
+              <w:rFonts w:ascii="Courier New" w:cs="Courier New" w:eastAsia="Courier New" w:hAnsi="Courier New"/>
+              <w:color w:val="1E293B"/>
+              <w:sz w:val="18"/>
+              <w:szCs w:val="18"/>
+            </w:rPr>
+            <w:t>creditPurpose</w:t>
+          </w:r>
+        </w:p>
+      </w:tc>
+      <w:tc>
+        <w:tcPr>
+          <w:tcW w:w="1600" w:type="dxa"/>
+        </w:tcPr>
+        <w:p>
+          <w:pPr>
+            <w:spacing w:after="40" w:before="40" w:line="250"/>
+          </w:pPr>
+          <w:r>
+            <w:rPr>
+              <w:rFonts w:ascii="Courier New" w:cs="Courier New" w:eastAsia="Courier New" w:hAnsi="Courier New"/>
+              <w:color w:val="1E293B"/>
+              <w:sz w:val="18"/>
+              <w:szCs w:val="18"/>
+            </w:rPr>
+            <w:t>String</w:t>
+          </w:r>
+        </w:p>
+      </w:tc>
+      <w:tc>
+        <w:tcPr>
+          <w:tcW w:w="5300" w:type="dxa"/>
+        </w:tcPr>
+        <w:p>
+          <w:pPr>
+            <w:spacing w:after="40" w:before="40" w:line="250"/>
+          </w:pPr>
+          <w:r>
+            <w:rPr>
+              <w:rFonts w:ascii="Calibri" w:cs="Calibri" w:eastAsia="Calibri" w:hAnsi="Calibri"/>
+              <w:color w:val="1E293B"/>
+              <w:sz w:val="18"/>
+              <w:szCs w:val="18"/>
+            </w:rPr>
+            <w:t>Purpose code: 001=Consumer, 002=Oil, 003=Mortgage, 004=Trade, 005=Energy, 006=Agriculture, 007=Construction, 008=Industry, 009=Transport, 010=Other</w:t>
+          </w:r>
+        </w:p>
+      </w:tc>
+      <w:tc>
+        <w:tcPr>
+          <w:tcW w:w="2400" w:type="dxa"/>
+        </w:tcPr>
+        <w:p>
+          <w:pPr>
+            <w:spacing w:after="40" w:before="40" w:line="250"/>
+          </w:pPr>
+          <w:r>
+            <w:rPr>
+              <w:rFonts w:ascii="Courier New" w:cs="Courier New" w:eastAsia="Courier New" w:hAnsi="Courier New"/>
+              <w:color w:val="1E293B"/>
+              <w:sz w:val="18"/>
+              <w:szCs w:val="18"/>
+            </w:rPr>
+            <w:t>creditPurposeName</w:t>
+          </w:r>
+        </w:p>
+      </w:tc>
+      <w:tc>
+        <w:tcPr>
+          <w:tcW w:w="1600" w:type="dxa"/>
+        </w:tcPr>
+        <w:p>
+          <w:pPr>
+            <w:spacing w:after="40" w:before="40" w:line="250"/>
+          </w:pPr>
+          <w:r>
+            <w:rPr>
+              <w:rFonts w:ascii="Courier New" w:cs="Courier New" w:eastAsia="Courier New" w:hAnsi="Courier New"/>
+              <w:color w:val="1E293B"/>
+              <w:sz w:val="18"/>
+              <w:szCs w:val="18"/>
+            </w:rPr>
+            <w:t>String</w:t>
+          </w:r>
+        </w:p>
+      </w:tc>
+      <w:tc>
+        <w:tcPr>
+          <w:tcW w:w="5300" w:type="dxa"/>
+        </w:tcPr>
+        <w:p>
+          <w:pPr>
+            <w:spacing w:after="40" w:before="40" w:line="250"/>
+          </w:pPr>
+          <w:r>
+            <w:rPr>
+              <w:rFonts w:ascii="Calibri" w:cs="Calibri" w:eastAsia="Calibri" w:hAnsi="Calibri"/>
+              <w:color w:val="1E293B"/>
+              <w:sz w:val="18"/>
+              <w:szCs w:val="18"/>
+            </w:rPr>
+            <w:t>Human-readable credit purpose name (localized)</w:t>
+          </w:r>
+        </w:p>
+      </w:tc>
+      <w:tc>
+        <w:tcPr>
+          <w:tcW w:w="2400" w:type="dxa"/>
+        </w:tcPr>
+        <w:p>
+          <w:pPr>
+            <w:spacing w:after="40" w:before="40" w:line="250"/>
+          </w:pPr>
+          <w:r>
+            <w:rPr>
+              <w:rFonts w:ascii="Courier New" w:cs="Courier New" w:eastAsia="Courier New" w:hAnsi="Courier New"/>
+              <w:color w:val="1E293B"/>
+              <w:sz w:val="18"/>
+              <w:szCs w:val="18"/>
+            </w:rPr>
+            <w:t>currency</w:t>
+          </w:r>
+        </w:p>
+      </w:tc>
+      <w:tc>
+        <w:tcPr>
+          <w:tcW w:w="1600" w:type="dxa"/>
+        </w:tcPr>
+        <w:p>
+          <w:pPr>
+            <w:spacing w:after="40" w:before="40" w:line="250"/>
+          </w:pPr>
+          <w:r>
+            <w:rPr>
+              <w:rFonts w:ascii="Courier New" w:cs="Courier New" w:eastAsia="Courier New" w:hAnsi="Courier New"/>
+              <w:color w:val="1E293B"/>
+              <w:sz w:val="18"/>
+              <w:szCs w:val="18"/>
+            </w:rPr>
+            <w:t>String</w:t>
+          </w:r>
+        </w:p>
+      </w:tc>
+      <w:tc>
+        <w:tcPr>
+          <w:tcW w:w="5300" w:type="dxa"/>
+        </w:tcPr>
+        <w:p>
+          <w:pPr>
+            <w:spacing w:after="40" w:before="40" w:line="250"/>
+          </w:pPr>
+          <w:r>
+            <w:rPr>
+              <w:rFonts w:ascii="Calibri" w:cs="Calibri" w:eastAsia="Calibri" w:hAnsi="Calibri"/>
+              <w:color w:val="1E293B"/>
+              <w:sz w:val="18"/>
+              <w:szCs w:val="18"/>
+            </w:rPr>
+            <w:t>Currency code (AZN, USD, EUR); key field for monthly obligations</w:t>
+          </w:r>
+        </w:p>
+      </w:tc>
+      <w:tc>
+        <w:tcPr>
+          <w:tcW w:w="2400" w:type="dxa"/>
+        </w:tcPr>
+        <w:p>
+          <w:pPr>
+            <w:spacing w:after="40" w:before="40" w:line="250"/>
+          </w:pPr>
+          <w:r>
+            <w:rPr>
+              <w:rFonts w:ascii="Courier New" w:cs="Courier New" w:eastAsia="Courier New" w:hAnsi="Courier New"/>
+              <w:color w:val="1E293B"/>
+              <w:sz w:val="18"/>
+              <w:szCs w:val="18"/>
+            </w:rPr>
+            <w:t>currencyName</w:t>
+          </w:r>
+        </w:p>
+      </w:tc>
+      <w:tc>
+        <w:tcPr>
+          <w:tcW w:w="1600" w:type="dxa"/>
+        </w:tcPr>
+        <w:p>
+          <w:pPr>
+            <w:spacing w:after="40" w:before="40" w:line="250"/>
+          </w:pPr>
+          <w:r>
+            <w:rPr>
+              <w:rFonts w:ascii="Courier New" w:cs="Courier New" w:eastAsia="Courier New" w:hAnsi="Courier New"/>
+              <w:color w:val="1E293B"/>
+              <w:sz w:val="18"/>
+              <w:szCs w:val="18"/>
+            </w:rPr>
+            <w:t>String</w:t>
+          </w:r>
+        </w:p>
+      </w:tc>
+      <w:tc>
+        <w:tcPr>
+          <w:tcW w:w="5300" w:type="dxa"/>
+        </w:tcPr>
+        <w:p>
+          <w:pPr>
+            <w:spacing w:after="40" w:before="40" w:line="250"/>
+          </w:pPr>
+          <w:r>
+            <w:rPr>
+              <w:rFonts w:ascii="Calibri" w:cs="Calibri" w:eastAsia="Calibri" w:hAnsi="Calibri"/>
+              <w:color w:val="1E293B"/>
+              <w:sz w:val="18"/>
+              <w:szCs w:val="18"/>
+            </w:rPr>
+            <w:t>Human-readable currency name</w:t>
+          </w:r>
+        </w:p>
+      </w:tc>
+      <w:tc>
+        <w:tcPr>
+          <w:tcW w:w="2400" w:type="dxa"/>
+        </w:tcPr>
+        <w:p>
+          <w:pPr>
+            <w:spacing w:after="40" w:before="40" w:line="250"/>
+          </w:pPr>
+          <w:r>
+            <w:rPr>
+              <w:rFonts w:ascii="Courier New" w:cs="Courier New" w:eastAsia="Courier New" w:hAnsi="Courier New"/>
+              <w:color w:val="1E293B"/>
+              <w:sz w:val="18"/>
+              <w:szCs w:val="18"/>
+            </w:rPr>
+            <w:t>currencyRate</w:t>
+          </w:r>
+        </w:p>
+      </w:tc>
+      <w:tc>
+        <w:tcPr>
+          <w:tcW w:w="1600" w:type="dxa"/>
+        </w:tcPr>
+        <w:p>
+          <w:pPr>
+            <w:spacing w:after="40" w:before="40" w:line="250"/>
+          </w:pPr>
+          <w:r>
+            <w:rPr>
+              <w:rFonts w:ascii="Courier New" w:cs="Courier New" w:eastAsia="Courier New" w:hAnsi="Courier New"/>
+              <w:color w:val="1E293B"/>
+              <w:sz w:val="18"/>
+              <w:szCs w:val="18"/>
+            </w:rPr>
+            <w:t>BigDecimal</w:t>
+          </w:r>
+        </w:p>
+      </w:tc>
+      <w:tc>
+        <w:tcPr>
+          <w:tcW w:w="5300" w:type="dxa"/>
+        </w:tcPr>
+        <w:p>
+          <w:pPr>
+            <w:spacing w:after="40" w:before="40" w:line="250"/>
+          </w:pPr>
+          <w:r>
+            <w:rPr>
+              <w:rFonts w:ascii="Calibri" w:cs="Calibri" w:eastAsia="Calibri" w:hAnsi="Calibri"/>
+              <w:color w:val="1E293B"/>
+              <w:sz w:val="18"/>
+              <w:szCs w:val="18"/>
+            </w:rPr>
+            <w:t>Exchange rate to base currency (default: 1)</w:t>
+          </w:r>
+        </w:p>
+      </w:tc>
+      <w:tc>
+        <w:tcPr>
+          <w:tcW w:w="2400" w:type="dxa"/>
+        </w:tcPr>
+        <w:p>
+          <w:pPr>
+            <w:spacing w:after="40" w:before="40" w:line="250"/>
+          </w:pPr>
+          <w:r>
+            <w:rPr>
+              <w:rFonts w:ascii="Courier New" w:cs="Courier New" w:eastAsia="Courier New" w:hAnsi="Courier New"/>
+              <w:color w:val="1E293B"/>
+              <w:sz w:val="18"/>
+              <w:szCs w:val="18"/>
+            </w:rPr>
+            <w:t>mkrId</w:t>
+          </w:r>
+        </w:p>
+      </w:tc>
+      <w:tc>
+        <w:tcPr>
+          <w:tcW w:w="1600" w:type="dxa"/>
+        </w:tcPr>
+        <w:p>
+          <w:pPr>
+            <w:spacing w:after="40" w:before="40" w:line="250"/>
+          </w:pPr>
+          <w:r>
+            <w:rPr>
+              <w:rFonts w:ascii="Courier New" w:cs="Courier New" w:eastAsia="Courier New" w:hAnsi="Courier New"/>
+              <w:color w:val="1E293B"/>
+              <w:sz w:val="18"/>
+              <w:szCs w:val="18"/>
+            </w:rPr>
+            <w:t>String</w:t>
+          </w:r>
+        </w:p>
+      </w:tc>
+      <w:tc>
+        <w:tcPr>
+          <w:tcW w:w="5300" w:type="dxa"/>
+        </w:tcPr>
+        <w:p>
+          <w:pPr>
+            <w:spacing w:after="40" w:before="40" w:line="250"/>
+          </w:pPr>
+          <w:r>
+            <w:rPr>
+              <w:rFonts w:ascii="Calibri" w:cs="Calibri" w:eastAsia="Calibri" w:hAnsi="Calibri"/>
+              <w:color w:val="1E293B"/>
+              <w:sz w:val="18"/>
+              <w:szCs w:val="18"/>
+            </w:rPr>
+            <w:t>MKR (Central Credit Registry) internal identifier</w:t>
+          </w:r>
+        </w:p>
+      </w:tc>
+      <w:tc>
+        <w:tcPr>
+          <w:tcW w:w="2400" w:type="dxa"/>
+        </w:tcPr>
+        <w:p>
+          <w:pPr>
+            <w:spacing w:after="40" w:before="40" w:line="250"/>
+          </w:pPr>
+          <w:r>
+            <w:rPr>
+              <w:rFonts w:ascii="Courier New" w:cs="Courier New" w:eastAsia="Courier New" w:hAnsi="Courier New"/>
+              <w:color w:val="1E293B"/>
+              <w:sz w:val="18"/>
+              <w:szCs w:val="18"/>
+            </w:rPr>
+            <w:t>collateralCode</w:t>
+          </w:r>
+        </w:p>
+      </w:tc>
+      <w:tc>
+        <w:tcPr>
+          <w:tcW w:w="1600" w:type="dxa"/>
+        </w:tcPr>
+        <w:p>
+          <w:pPr>
+            <w:spacing w:after="40" w:before="40" w:line="250"/>
+          </w:pPr>
+          <w:r>
+            <w:rPr>
+              <w:rFonts w:ascii="Courier New" w:cs="Courier New" w:eastAsia="Courier New" w:hAnsi="Courier New"/>
+              <w:color w:val="1E293B"/>
+              <w:sz w:val="18"/>
+              <w:szCs w:val="18"/>
+            </w:rPr>
+            <w:t>String</w:t>
+          </w:r>
+        </w:p>
+      </w:tc>
+      <w:tc>
+        <w:tcPr>
+          <w:tcW w:w="5300" w:type="dxa"/>
+        </w:tcPr>
+        <w:p>
+          <w:pPr>
+            <w:spacing w:after="40" w:before="40" w:line="250"/>
+          </w:pPr>
+          <w:r>
+            <w:rPr>
+              <w:rFonts w:ascii="Calibri" w:cs="Calibri" w:eastAsia="Calibri" w:hAnsi="Calibri"/>
+              <w:color w:val="1E293B"/>
+              <w:sz w:val="18"/>
+              <w:szCs w:val="18"/>
+            </w:rPr>
+            <w:t>Collateral type: 001=Real Estate, 002=Movable, 003=Cash, 004=Guarantee, 005=Warranty, 006=Other, 007=Unsecured</w:t>
+          </w:r>
+        </w:p>
+      </w:tc>
+      <w:tc>
+        <w:tcPr>
+          <w:tcW w:w="2400" w:type="dxa"/>
+        </w:tcPr>
+        <w:p>
+          <w:pPr>
+            <w:spacing w:after="40" w:before="40" w:line="250"/>
+          </w:pPr>
+          <w:r>
+            <w:rPr>
+              <w:rFonts w:ascii="Courier New" w:cs="Courier New" w:eastAsia="Courier New" w:hAnsi="Courier New"/>
+              <w:color w:val="1E293B"/>
+              <w:sz w:val="18"/>
+              <w:szCs w:val="18"/>
+            </w:rPr>
+            <w:t>collateralTypeName</w:t>
+          </w:r>
+        </w:p>
+      </w:tc>
+      <w:tc>
+        <w:tcPr>
+          <w:tcW w:w="1600" w:type="dxa"/>
+        </w:tcPr>
+        <w:p>
+          <w:pPr>
+            <w:spacing w:after="40" w:before="40" w:line="250"/>
+          </w:pPr>
+          <w:r>
+            <w:rPr>
+              <w:rFonts w:ascii="Courier New" w:cs="Courier New" w:eastAsia="Courier New" w:hAnsi="Courier New"/>
+              <w:color w:val="1E293B"/>
+              <w:sz w:val="18"/>
+              <w:szCs w:val="18"/>
+            </w:rPr>
+            <w:t>String</w:t>
+          </w:r>
+        </w:p>
+      </w:tc>
+      <w:tc>
+        <w:tcPr>
+          <w:tcW w:w="5300" w:type="dxa"/>
+        </w:tcPr>
+        <w:p>
+          <w:pPr>
+            <w:spacing w:after="40" w:before="40" w:line="250"/>
+          </w:pPr>
+          <w:r>
+            <w:rPr>
+              <w:rFonts w:ascii="Calibri" w:cs="Calibri" w:eastAsia="Calibri" w:hAnsi="Calibri"/>
+              <w:color w:val="1E293B"/>
+              <w:sz w:val="18"/>
+              <w:szCs w:val="18"/>
+            </w:rPr>
+            <w:t>Human-readable collateral type name</w:t>
+          </w:r>
+        </w:p>
+      </w:tc>
+      <w:tc>
+        <w:tcPr>
+          <w:tcW w:w="2400" w:type="dxa"/>
+        </w:tcPr>
+        <w:p>
+          <w:pPr>
+            <w:spacing w:after="40" w:before="40" w:line="250"/>
+          </w:pPr>
+          <w:r>
+            <w:rPr>
+              <w:rFonts w:ascii="Courier New" w:cs="Courier New" w:eastAsia="Courier New" w:hAnsi="Courier New"/>
+              <w:color w:val="1E293B"/>
+              <w:sz w:val="18"/>
+              <w:szCs w:val="18"/>
+            </w:rPr>
+            <w:t>collateralMarketValue</w:t>
+          </w:r>
+        </w:p>
+      </w:tc>
+      <w:tc>
+        <w:tcPr>
+          <w:tcW w:w="1600" w:type="dxa"/>
+        </w:tcPr>
+        <w:p>
+          <w:pPr>
+            <w:spacing w:after="40" w:before="40" w:line="250"/>
+          </w:pPr>
+          <w:r>
+            <w:rPr>
+              <w:rFonts w:ascii="Courier New" w:cs="Courier New" w:eastAsia="Courier New" w:hAnsi="Courier New"/>
+              <w:color w:val="1E293B"/>
+              <w:sz w:val="18"/>
+              <w:szCs w:val="18"/>
+            </w:rPr>
+            <w:t>BigDecimal</w:t>
+          </w:r>
+        </w:p>
+      </w:tc>
+      <w:tc>
+        <w:tcPr>
+          <w:tcW w:w="5300" w:type="dxa"/>
+        </w:tcPr>
+        <w:p>
+          <w:pPr>
+            <w:spacing w:after="40" w:before="40" w:line="250"/>
+          </w:pPr>
+          <w:r>
+            <w:rPr>
+              <w:rFonts w:ascii="Calibri" w:cs="Calibri" w:eastAsia="Calibri" w:hAnsi="Calibri"/>
+              <w:color w:val="1E293B"/>
+              <w:sz w:val="18"/>
+              <w:szCs w:val="18"/>
+            </w:rPr>
+            <w:t>Market value of collateral</w:t>
+          </w:r>
+        </w:p>
+      </w:tc>
+      <w:tc>
+        <w:tcPr>
+          <w:tcW w:w="2400" w:type="dxa"/>
+        </w:tcPr>
+        <w:p>
+          <w:pPr>
+            <w:spacing w:after="40" w:before="40" w:line="250"/>
+          </w:pPr>
+          <w:r>
+            <w:rPr>
+              <w:rFonts w:ascii="Courier New" w:cs="Courier New" w:eastAsia="Courier New" w:hAnsi="Courier New"/>
+              <w:color w:val="1E293B"/>
+              <w:sz w:val="18"/>
+              <w:szCs w:val="18"/>
+            </w:rPr>
+            <w:t>collateralRegistryAgency</w:t>
+          </w:r>
+        </w:p>
+      </w:tc>
+      <w:tc>
+        <w:tcPr>
+          <w:tcW w:w="1600" w:type="dxa"/>
+        </w:tcPr>
+        <w:p>
+          <w:pPr>
+            <w:spacing w:after="40" w:before="40" w:line="250"/>
+          </w:pPr>
+          <w:r>
+            <w:rPr>
+              <w:rFonts w:ascii="Courier New" w:cs="Courier New" w:eastAsia="Courier New" w:hAnsi="Courier New"/>
+              <w:color w:val="1E293B"/>
+              <w:sz w:val="18"/>
+              <w:szCs w:val="18"/>
+            </w:rPr>
+            <w:t>String</w:t>
+          </w:r>
+        </w:p>
+      </w:tc>
+      <w:tc>
+        <w:tcPr>
+          <w:tcW w:w="5300" w:type="dxa"/>
+        </w:tcPr>
+        <w:p>
+          <w:pPr>
+            <w:spacing w:after="40" w:before="40" w:line="250"/>
+          </w:pPr>
+          <w:r>
+            <w:rPr>
+              <w:rFonts w:ascii="Calibri" w:cs="Calibri" w:eastAsia="Calibri" w:hAnsi="Calibri"/>
+              <w:color w:val="1E293B"/>
+              <w:sz w:val="18"/>
+              <w:szCs w:val="18"/>
+            </w:rPr>
+            <w:t>Registry agency where collateral is registered</w:t>
+          </w:r>
+        </w:p>
+      </w:tc>
+      <w:tc>
+        <w:tcPr>
+          <w:tcW w:w="2400" w:type="dxa"/>
+        </w:tcPr>
+        <w:p>
+          <w:pPr>
+            <w:spacing w:after="40" w:before="40" w:line="250"/>
+          </w:pPr>
+          <w:r>
+            <w:rPr>
+              <w:rFonts w:ascii="Courier New" w:cs="Courier New" w:eastAsia="Courier New" w:hAnsi="Courier New"/>
+              <w:color w:val="1E293B"/>
+              <w:sz w:val="18"/>
+              <w:szCs w:val="18"/>
+            </w:rPr>
+            <w:t>collateralRegistryDate</w:t>
+          </w:r>
+        </w:p>
+      </w:tc>
+      <w:tc>
+        <w:tcPr>
+          <w:tcW w:w="1600" w:type="dxa"/>
+        </w:tcPr>
+        <w:p>
+          <w:pPr>
+            <w:spacing w:after="40" w:before="40" w:line="250"/>
+          </w:pPr>
+          <w:r>
+            <w:rPr>
+              <w:rFonts w:ascii="Courier New" w:cs="Courier New" w:eastAsia="Courier New" w:hAnsi="Courier New"/>
+              <w:color w:val="1E293B"/>
+              <w:sz w:val="18"/>
+              <w:szCs w:val="18"/>
+            </w:rPr>
+            <w:t>dateTime</w:t>
+          </w:r>
+        </w:p>
+      </w:tc>
+      <w:tc>
+        <w:tcPr>
+          <w:tcW w:w="5300" w:type="dxa"/>
+        </w:tcPr>
+        <w:p>
+          <w:pPr>
+            <w:spacing w:after="40" w:before="40" w:line="250"/>
+          </w:pPr>
+          <w:r>
+            <w:rPr>
+              <w:rFonts w:ascii="Calibri" w:cs="Calibri" w:eastAsia="Calibri" w:hAnsi="Calibri"/>
+              <w:color w:val="1E293B"/>
+              <w:sz w:val="18"/>
+              <w:szCs w:val="18"/>
+            </w:rPr>
+            <w:t>Date of collateral registration</w:t>
+          </w:r>
+        </w:p>
+      </w:tc>
+      <w:tc>
+        <w:tcPr>
+          <w:tcW w:w="2400" w:type="dxa"/>
+        </w:tcPr>
+        <w:p>
+          <w:pPr>
+            <w:spacing w:after="40" w:before="40" w:line="250"/>
+          </w:pPr>
+          <w:r>
+            <w:rPr>
+              <w:rFonts w:ascii="Courier New" w:cs="Courier New" w:eastAsia="Courier New" w:hAnsi="Courier New"/>
+              <w:color w:val="1E293B"/>
+              <w:sz w:val="18"/>
+              <w:szCs w:val="18"/>
+            </w:rPr>
+            <w:t>collateralRegistryNo</w:t>
+          </w:r>
+        </w:p>
+      </w:tc>
+      <w:tc>
+        <w:tcPr>
+          <w:tcW w:w="1600" w:type="dxa"/>
+        </w:tcPr>
+        <w:p>
+          <w:pPr>
+            <w:spacing w:after="40" w:before="40" w:line="250"/>
+          </w:pPr>
+          <w:r>
+            <w:rPr>
+              <w:rFonts w:ascii="Courier New" w:cs="Courier New" w:eastAsia="Courier New" w:hAnsi="Courier New"/>
+              <w:color w:val="1E293B"/>
+              <w:sz w:val="18"/>
+              <w:szCs w:val="18"/>
+            </w:rPr>
+            <w:t>String</w:t>
+          </w:r>
+        </w:p>
+      </w:tc>
+      <w:tc>
+        <w:tcPr>
+          <w:tcW w:w="5300" w:type="dxa"/>
+        </w:tcPr>
+        <w:p>
+          <w:pPr>
+            <w:spacing w:after="40" w:before="40" w:line="250"/>
+          </w:pPr>
+          <w:r>
+            <w:rPr>
+              <w:rFonts w:ascii="Calibri" w:cs="Calibri" w:eastAsia="Calibri" w:hAnsi="Calibri"/>
+              <w:color w:val="1E293B"/>
+              <w:sz w:val="18"/>
+              <w:szCs w:val="18"/>
+            </w:rPr>
+            <w:t>Collateral registry number</w:t>
+          </w:r>
+        </w:p>
+      </w:tc>
+      <w:tc>
+        <w:tcPr>
+          <w:tcW w:w="2400" w:type="dxa"/>
+        </w:tcPr>
+        <w:p>
+          <w:pPr>
+            <w:spacing w:after="40" w:before="40" w:line="250"/>
+          </w:pPr>
+          <w:r>
+            <w:rPr>
+              <w:rFonts w:ascii="Courier New" w:cs="Courier New" w:eastAsia="Courier New" w:hAnsi="Courier New"/>
+              <w:color w:val="1E293B"/>
+              <w:sz w:val="18"/>
+              <w:szCs w:val="18"/>
+            </w:rPr>
+            <w:t>collateralAnyInfo</w:t>
+          </w:r>
+        </w:p>
+      </w:tc>
+      <w:tc>
+        <w:tcPr>
+          <w:tcW w:w="1600" w:type="dxa"/>
+        </w:tcPr>
+        <w:p>
+          <w:pPr>
+            <w:spacing w:after="40" w:before="40" w:line="250"/>
+          </w:pPr>
+          <w:r>
+            <w:rPr>
+              <w:rFonts w:ascii="Courier New" w:cs="Courier New" w:eastAsia="Courier New" w:hAnsi="Courier New"/>
+              <w:color w:val="1E293B"/>
+              <w:sz w:val="18"/>
+              <w:szCs w:val="18"/>
+            </w:rPr>
+            <w:t>String</w:t>
+          </w:r>
+        </w:p>
+      </w:tc>
+      <w:tc>
+        <w:tcPr>
+          <w:tcW w:w="5300" w:type="dxa"/>
+        </w:tcPr>
+        <w:p>
+          <w:pPr>
+            <w:spacing w:after="40" w:before="40" w:line="250"/>
+          </w:pPr>
+          <w:r>
+            <w:rPr>
+              <w:rFonts w:ascii="Calibri" w:cs="Calibri" w:eastAsia="Calibri" w:hAnsi="Calibri"/>
+              <w:color w:val="1E293B"/>
+              <w:sz w:val="18"/>
+              <w:szCs w:val="18"/>
+            </w:rPr>
+            <w:t>Additional collateral information/notes</w:t>
+          </w:r>
+        </w:p>
+      </w:tc>
+      <w:tc>
+        <w:tcPr>
+          <w:tcW w:w="2400" w:type="dxa"/>
+        </w:tcPr>
+        <w:p>
+          <w:pPr>
+            <w:spacing w:after="40" w:before="40" w:line="250"/>
+          </w:pPr>
+          <w:r>
+            <w:rPr>
+              <w:rFonts w:ascii="Courier New" w:cs="Courier New" w:eastAsia="Courier New" w:hAnsi="Courier New"/>
+              <w:color w:val="1E293B"/>
+              <w:sz w:val="18"/>
+              <w:szCs w:val="18"/>
+            </w:rPr>
+            <w:t>history</w:t>
+          </w:r>
+        </w:p>
+      </w:tc>
+      <w:tc>
+        <w:tcPr>
+          <w:tcW w:w="1600" w:type="dxa"/>
+        </w:tcPr>
+        <w:p>
+          <w:pPr>
+            <w:spacing w:after="40" w:before="40" w:line="250"/>
+          </w:pPr>
+          <w:r>
+            <w:rPr>
+              <w:rFonts w:ascii="Courier New" w:cs="Courier New" w:eastAsia="Courier New" w:hAnsi="Courier New"/>
+              <w:color w:val="1E293B"/>
+              <w:sz w:val="18"/>
+              <w:szCs w:val="18"/>
+            </w:rPr>
+            <w:t>LiabilityHistoryWrapper</w:t>
+          </w:r>
+        </w:p>
+      </w:tc>
+      <w:tc>
+        <w:tcPr>
+          <w:tcW w:w="5300" w:type="dxa"/>
+        </w:tcPr>
+        <w:p>
+          <w:pPr>
+            <w:spacing w:after="40" w:before="40" w:line="250"/>
+          </w:pPr>
+          <w:r>
+            <w:rPr>
+              <w:rFonts w:ascii="Calibri" w:cs="Calibri" w:eastAsia="Calibri" w:hAnsi="Calibri"/>
+              <w:color w:val="1E293B"/>
+              <w:sz w:val="18"/>
+              <w:szCs w:val="18"/>
+            </w:rPr>
+            <w:t>Nested object with List of CreditHistoryLine items (monthly overdue history)</w:t>
+          </w:r>
+        </w:p>
+      </w:tc>
+    </w:tbl>
+    <w:p>
+      <w:pPr>
+        <w:spacing w:after="200" w:before="200"/>
+      </w:pPr>
+    </w:p>
+    <w:p>
+      <w:pPr>
+        <w:pStyle w:val="Heading2"/>
+        <w:spacing w:after="200" w:before="400"/>
+      </w:pPr>
+      <w:r>
+        <w:rPr>
+          <w:rFonts w:ascii="Times New Roman" w:cs="Times New Roman" w:eastAsia="Times New Roman" w:hAnsi="Times New Roman"/>
+          <w:b/>
+          <w:bCs/>
+          <w:color w:val="020617"/>
+          <w:sz w:val="28"/>
+          <w:szCs w:val="28"/>
+        </w:rPr>
+        <w:t xml:space="preserve">3.8 CreditHistoryLine (Kredit Tarixcəsi) Field-ləri</w:t>
+      </w:r>
+    </w:p>
+    <w:p>
+      <w:pPr>
+        <w:spacing w:after="80" w:before="80"/>
+      </w:pPr>
+      <w:r>
+        <w:rPr>
+          <w:rFonts w:ascii="Calibri" w:cs="Calibri" w:eastAsia="Calibri" w:hAnsi="Calibri"/>
+          <w:i/>
+          <w:iCs/>
+          <w:color w:val="64748B"/>
+          <w:sz w:val="18"/>
+          <w:szCs w:val="18"/>
+        </w:rPr>
+        <w:t xml:space="preserve">Cədvəl 3.7 — CreditHistoryLine obyektinin field-ləri (history.historyItem daxildir)</w:t>
+      </w:r>
+    </w:p>
+    <w:tbl>
+      <w:tblPr>
+        <w:tblStyle w:val="TableGrid"/>
+        <w:tblW w:w="0" w:type="auto"/>
+        <w:tblBorders>
+          <w:top w:val="single" w:sz="12" w:color="9AA6B2"/>
+          <w:bottom w:val="single" w:sz="12" w:color="9AA6B2"/>
+          <w:insideH w:val="single" w:sz="4" w:color="D1D5DB"/>
+          <w:left w:val="nil"/>
+          <w:right w:val="nil"/>
+        </w:tblBorders>
+      </w:tblPr>
+      <w:tblGrid>
+        <w:gridCol w:w="2400"/>
+        <w:gridCol w:w="1600"/>
+        <w:gridCol w:w="5300"/>
+      </w:tblGrid>
+      <w:tc>
+        <w:tcPr>
+          <w:tcW w:w="2400" w:type="dxa"/>
+          <w:shd w:fill="020617" w:val="clear"/>
+        </w:tcPr>
+        <w:p>
+          <w:pPr>
+            <w:spacing w:after="60" w:before="60" w:line="250"/>
+            <w:jc w:val="left"/>
+          </w:pPr>
+          <w:r>
+            <w:rPr>
+              <w:rFonts w:ascii="Calibri" w:cs="Calibri" w:eastAsia="Calibri" w:hAnsi="Calibri"/>
+              <w:b/>
+              <w:bCs/>
+              <w:color w:val="FFFFFF"/>
+              <w:sz w:val="19"/>
+              <w:szCs w:val="19"/>
+            </w:rPr>
+            <w:t>Field Name</w:t>
+          </w:r>
+        </w:p>
+      </w:tc>
+      <w:tc>
+        <w:tcPr>
+          <w:tcW w:w="1600" w:type="dxa"/>
+          <w:shd w:fill="020617" w:val="clear"/>
+        </w:tcPr>
+        <w:p>
+          <w:pPr>
+            <w:spacing w:after="60" w:before="60" w:line="250"/>
+            <w:jc w:val="left"/>
+          </w:pPr>
+          <w:r>
+            <w:rPr>
+              <w:rFonts w:ascii="Calibri" w:cs="Calibri" w:eastAsia="Calibri" w:hAnsi="Calibri"/>
+              <w:b/>
+              <w:bCs/>
+              <w:color w:val="FFFFFF"/>
+              <w:sz w:val="19"/>
+              <w:szCs w:val="19"/>
+            </w:rPr>
+            <w:t>Type</w:t>
+          </w:r>
+        </w:p>
+      </w:tc>
+      <w:tc>
+        <w:tcPr>
+          <w:tcW w:w="5300" w:type="dxa"/>
+          <w:shd w:fill="020617" w:val="clear"/>
+        </w:tcPr>
+        <w:p>
+          <w:pPr>
+            <w:spacing w:after="60" w:before="60" w:line="250"/>
+            <w:jc w:val="left"/>
+          </w:pPr>
+          <w:r>
+            <w:rPr>
+              <w:rFonts w:ascii="Calibri" w:cs="Calibri" w:eastAsia="Calibri" w:hAnsi="Calibri"/>
+              <w:b/>
+              <w:bCs/>
+              <w:color w:val="FFFFFF"/>
+              <w:sz w:val="19"/>
+              <w:szCs w:val="19"/>
+            </w:rPr>
+            <w:t>Description (EN)</w:t>
+          </w:r>
+        </w:p>
+      </w:tc>
+      <w:tc>
+        <w:tcPr>
+          <w:tcW w:w="2400" w:type="dxa"/>
+        </w:tcPr>
+        <w:p>
+          <w:pPr>
+            <w:spacing w:after="40" w:before="40" w:line="250"/>
+          </w:pPr>
+          <w:r>
+            <w:rPr>
+              <w:rFonts w:ascii="Courier New" w:cs="Courier New" w:eastAsia="Courier New" w:hAnsi="Courier New"/>
+              <w:color w:val="1E293B"/>
+              <w:sz w:val="18"/>
+              <w:szCs w:val="18"/>
+            </w:rPr>
+            <w:t>overdueDays</w:t>
+          </w:r>
+        </w:p>
+      </w:tc>
+      <w:tc>
+        <w:tcPr>
+          <w:tcW w:w="1600" w:type="dxa"/>
+        </w:tcPr>
+        <w:p>
+          <w:pPr>
+            <w:spacing w:after="40" w:before="40" w:line="250"/>
+          </w:pPr>
+          <w:r>
+            <w:rPr>
+              <w:rFonts w:ascii="Courier New" w:cs="Courier New" w:eastAsia="Courier New" w:hAnsi="Courier New"/>
+              <w:color w:val="1E293B"/>
+              <w:sz w:val="18"/>
+              <w:szCs w:val="18"/>
+            </w:rPr>
+            <w:t>Long</w:t>
+          </w:r>
+        </w:p>
+      </w:tc>
+      <w:tc>
+        <w:tcPr>
+          <w:tcW w:w="5300" w:type="dxa"/>
+        </w:tcPr>
+        <w:p>
+          <w:pPr>
+            <w:spacing w:after="40" w:before="40" w:line="250"/>
+          </w:pPr>
+          <w:r>
+            <w:rPr>
+              <w:rFonts w:ascii="Calibri" w:cs="Calibri" w:eastAsia="Calibri" w:hAnsi="Calibri"/>
+              <w:color w:val="1E293B"/>
+              <w:sz w:val="18"/>
+              <w:szCs w:val="18"/>
+            </w:rPr>
+            <w:t>Number of overdue days in this reporting period; used in max-overdue calculations (MKR indicators 29, 30, 31)</w:t>
+          </w:r>
+        </w:p>
+      </w:tc>
+      <w:tc>
+        <w:tcPr>
+          <w:tcW w:w="2400" w:type="dxa"/>
+        </w:tcPr>
+        <w:p>
+          <w:pPr>
+            <w:spacing w:after="40" w:before="40" w:line="250"/>
+          </w:pPr>
+          <w:r>
+            <w:rPr>
+              <w:rFonts w:ascii="Courier New" w:cs="Courier New" w:eastAsia="Courier New" w:hAnsi="Courier New"/>
+              <w:color w:val="1E293B"/>
+              <w:sz w:val="18"/>
+              <w:szCs w:val="18"/>
+            </w:rPr>
+            <w:t>reportingPeriod</w:t>
+          </w:r>
+        </w:p>
+      </w:tc>
+      <w:tc>
+        <w:tcPr>
+          <w:tcW w:w="1600" w:type="dxa"/>
+        </w:tcPr>
+        <w:p>
+          <w:pPr>
+            <w:spacing w:after="40" w:before="40" w:line="250"/>
+          </w:pPr>
+          <w:r>
+            <w:rPr>
+              <w:rFonts w:ascii="Courier New" w:cs="Courier New" w:eastAsia="Courier New" w:hAnsi="Courier New"/>
+              <w:color w:val="1E293B"/>
+              <w:sz w:val="18"/>
+              <w:szCs w:val="18"/>
+            </w:rPr>
+            <w:t>String</w:t>
+          </w:r>
+        </w:p>
+      </w:tc>
+      <w:tc>
+        <w:tcPr>
+          <w:tcW w:w="5300" w:type="dxa"/>
+        </w:tcPr>
+        <w:p>
+          <w:pPr>
+            <w:spacing w:after="40" w:before="40" w:line="250"/>
+          </w:pPr>
+          <w:r>
+            <w:rPr>
+              <w:rFonts w:ascii="Calibri" w:cs="Calibri" w:eastAsia="Calibri" w:hAnsi="Calibri"/>
+              <w:color w:val="1E293B"/>
+              <w:sz w:val="18"/>
+              <w:szCs w:val="18"/>
+            </w:rPr>
+            <w:t>Reporting period in format MMxYYYY (e.g., 06x2024); Clojure transforms to MM.YY</w:t>
+          </w:r>
+        </w:p>
+      </w:tc>
+      <w:tc>
+        <w:tcPr>
+          <w:tcW w:w="2400" w:type="dxa"/>
+        </w:tcPr>
+        <w:p>
+          <w:pPr>
+            <w:spacing w:after="40" w:before="40" w:line="250"/>
+          </w:pPr>
+          <w:r>
+            <w:rPr>
+              <w:rFonts w:ascii="Courier New" w:cs="Courier New" w:eastAsia="Courier New" w:hAnsi="Courier New"/>
+              <w:color w:val="1E293B"/>
+              <w:sz w:val="18"/>
+              <w:szCs w:val="18"/>
+            </w:rPr>
+            <w:t>creditStatus</w:t>
+          </w:r>
+        </w:p>
+      </w:tc>
+      <w:tc>
+        <w:tcPr>
+          <w:tcW w:w="1600" w:type="dxa"/>
+        </w:tcPr>
+        <w:p>
+          <w:pPr>
+            <w:spacing w:after="40" w:before="40" w:line="250"/>
+          </w:pPr>
+          <w:r>
+            <w:rPr>
+              <w:rFonts w:ascii="Courier New" w:cs="Courier New" w:eastAsia="Courier New" w:hAnsi="Courier New"/>
+              <w:color w:val="1E293B"/>
+              <w:sz w:val="18"/>
+              <w:szCs w:val="18"/>
+            </w:rPr>
+            <w:t>String</w:t>
+          </w:r>
+        </w:p>
+      </w:tc>
+      <w:tc>
+        <w:tcPr>
+          <w:tcW w:w="5300" w:type="dxa"/>
+        </w:tcPr>
+        <w:p>
+          <w:pPr>
+            <w:spacing w:after="40" w:before="40" w:line="250"/>
+          </w:pPr>
+          <w:r>
+            <w:rPr>
+              <w:rFonts w:ascii="Calibri" w:cs="Calibri" w:eastAsia="Calibri" w:hAnsi="Calibri"/>
+              <w:color w:val="1E293B"/>
+              <w:sz w:val="18"/>
+              <w:szCs w:val="18"/>
+            </w:rPr>
+            <w:t>Credit status as of this reporting period</w:t>
+          </w:r>
+        </w:p>
+      </w:tc>
+    </w:tbl>
+    <w:p>
+      <w:pPr>
+        <w:spacing w:after="200" w:before="200"/>
+      </w:pPr>
+    </w:p>
+    <w:p>
+      <w:pPr>
+        <w:pStyle w:val="Heading2"/>
+        <w:spacing w:after="200" w:before="400"/>
+      </w:pPr>
+      <w:r>
+        <w:rPr>
+          <w:rFonts w:ascii="Times New Roman" w:cs="Times New Roman" w:eastAsia="Times New Roman" w:hAnsi="Times New Roman"/>
+          <w:b/>
+          <w:bCs/>
+          <w:color w:val="020617"/>
+          <w:sz w:val="28"/>
+          <w:szCs w:val="28"/>
+        </w:rPr>
+        <w:t xml:space="preserve">3.9 Field Descriptions (English)</w:t>
       </w:r>
     </w:p>
     <w:p>
@@ -11659,7 +14189,7 @@
           <w:sz w:val="20"/>
           <w:szCs w:val="20"/>
         </w:rPr>
-        <w:t xml:space="preserve">Contains both active (liabilityOut) and historical (liabilityIn) credit obligations. Each liability includes monthlyPaymentAmount and currency, used by Clojure scoring to calculate total monthly obligations.</w:t>
+        <w:t xml:space="preserve">Wrapper (LiabilityWrapper) containing a list of all credit obligations, both active and closed. Each Liability object contains 37 fields: id, bankId, bankName, accountNo, creditType, creditTypeName, orgIDType, grantedOn, initialAmount, lineAmount, daysInterestOverdue, daysMainSumOverdue, contractDueOn, interestRate, lastUpdatedDate, lastPaymentDate, outstandingDebtMain, outstandingDebtInterest, monthlyPaymentAmount, prolongations, creditStatus, creditStatusName, creditStatusCloseDate, creditPurpose, creditPurposeName, currency, currencyName, currencyRate, mkrId, collateralCode, collateralTypeName, collateralMarketValue, collateralRegistryAgency, collateralRegistryDate, collateralRegistryNo, collateralAnyInfo, history (nested CreditHistoryLine list). Classification: Active = creditStatus in 002-009/011 AND creditStatusCloseDate is NULL; Closed = creditStatus is 001 OR (active status AND closeDate is NOT NULL). Key scoring fields: monthlyPaymentAmount + currency (summed for total monthly obligations); outstandingDebtMain (DTI ratios); creditStatus (active/closed). See Tables 3.6 and 3.7 for complete field list.</w:t>
       </w:r>
     </w:p>
     <w:p>
@@ -12935,6 +15465,771 @@
           <w:szCs w:val="18"/>
         </w:rPr>
         <w:t xml:space="preserve">        &lt;balance&gt;150.00&lt;/balance&gt;</w:t>
+      </w:r>
+    </w:p>
+    <w:p>
+      <w:pPr>
+        <w:spacing w:after="80" w:before="80" w:line="250"/>
+        <w:ind w:left="360"/>
+      </w:pPr>
+      <w:r>
+        <w:rPr>
+          <w:rFonts w:ascii="Courier New" w:cs="Courier New" w:eastAsia="Courier New" w:hAnsi="Courier New"/>
+          <w:color w:val="334155"/>
+          <w:sz w:val="18"/>
+          <w:szCs w:val="18"/>
+        </w:rPr>
+        <w:t xml:space="preserve">      &lt;liabilities&gt;</w:t>
+      </w:r>
+    </w:p>
+    <w:p>
+      <w:pPr>
+        <w:spacing w:after="80" w:before="80" w:line="250"/>
+        <w:ind w:left="360"/>
+      </w:pPr>
+      <w:r>
+        <w:rPr>
+          <w:rFonts w:ascii="Courier New" w:cs="Courier New" w:eastAsia="Courier New" w:hAnsi="Courier New"/>
+          <w:color w:val="334155"/>
+          <w:sz w:val="18"/>
+          <w:szCs w:val="18"/>
+        </w:rPr>
+        <w:t xml:space="preserve">        &lt;liability&gt;</w:t>
+      </w:r>
+    </w:p>
+    <w:p>
+      <w:pPr>
+        <w:spacing w:after="80" w:before="80" w:line="250"/>
+        <w:ind w:left="360"/>
+      </w:pPr>
+      <w:r>
+        <w:rPr>
+          <w:rFonts w:ascii="Courier New" w:cs="Courier New" w:eastAsia="Courier New" w:hAnsi="Courier New"/>
+          <w:color w:val="334155"/>
+          <w:sz w:val="18"/>
+          <w:szCs w:val="18"/>
+        </w:rPr>
+        <w:t xml:space="preserve">          &lt;id&gt;L-001&lt;/id&gt;</w:t>
+      </w:r>
+    </w:p>
+    <w:p>
+      <w:pPr>
+        <w:spacing w:after="80" w:before="80" w:line="250"/>
+        <w:ind w:left="360"/>
+      </w:pPr>
+      <w:r>
+        <w:rPr>
+          <w:rFonts w:ascii="Courier New" w:cs="Courier New" w:eastAsia="Courier New" w:hAnsi="Courier New"/>
+          <w:color w:val="334155"/>
+          <w:sz w:val="18"/>
+          <w:szCs w:val="18"/>
+        </w:rPr>
+        <w:t xml:space="preserve">          &lt;bankId&gt;BANK001&lt;/bankId&gt;</w:t>
+      </w:r>
+    </w:p>
+    <w:p>
+      <w:pPr>
+        <w:spacing w:after="80" w:before="80" w:line="250"/>
+        <w:ind w:left="360"/>
+      </w:pPr>
+      <w:r>
+        <w:rPr>
+          <w:rFonts w:ascii="Courier New" w:cs="Courier New" w:eastAsia="Courier New" w:hAnsi="Courier New"/>
+          <w:color w:val="334155"/>
+          <w:sz w:val="18"/>
+          <w:szCs w:val="18"/>
+        </w:rPr>
+        <w:t xml:space="preserve">          &lt;bankName&gt;Bank A&lt;/bankName&gt;</w:t>
+      </w:r>
+    </w:p>
+    <w:p>
+      <w:pPr>
+        <w:spacing w:after="80" w:before="80" w:line="250"/>
+        <w:ind w:left="360"/>
+      </w:pPr>
+      <w:r>
+        <w:rPr>
+          <w:rFonts w:ascii="Courier New" w:cs="Courier New" w:eastAsia="Courier New" w:hAnsi="Courier New"/>
+          <w:color w:val="334155"/>
+          <w:sz w:val="18"/>
+          <w:szCs w:val="18"/>
+        </w:rPr>
+        <w:t xml:space="preserve">          &lt;accountNo&gt;ACC-123456&lt;/accountNo&gt;</w:t>
+      </w:r>
+    </w:p>
+    <w:p>
+      <w:pPr>
+        <w:spacing w:after="80" w:before="80" w:line="250"/>
+        <w:ind w:left="360"/>
+      </w:pPr>
+      <w:r>
+        <w:rPr>
+          <w:rFonts w:ascii="Courier New" w:cs="Courier New" w:eastAsia="Courier New" w:hAnsi="Courier New"/>
+          <w:color w:val="334155"/>
+          <w:sz w:val="18"/>
+          <w:szCs w:val="18"/>
+        </w:rPr>
+        <w:t xml:space="preserve">          &lt;creditType&gt;001&lt;/creditType&gt;</w:t>
+      </w:r>
+    </w:p>
+    <w:p>
+      <w:pPr>
+        <w:spacing w:after="80" w:before="80" w:line="250"/>
+        <w:ind w:left="360"/>
+      </w:pPr>
+      <w:r>
+        <w:rPr>
+          <w:rFonts w:ascii="Courier New" w:cs="Courier New" w:eastAsia="Courier New" w:hAnsi="Courier New"/>
+          <w:color w:val="334155"/>
+          <w:sz w:val="18"/>
+          <w:szCs w:val="18"/>
+        </w:rPr>
+        <w:t xml:space="preserve">          &lt;creditTypeName&gt;Kredit&lt;/creditTypeName&gt;</w:t>
+      </w:r>
+    </w:p>
+    <w:p>
+      <w:pPr>
+        <w:spacing w:after="80" w:before="80" w:line="250"/>
+        <w:ind w:left="360"/>
+      </w:pPr>
+      <w:r>
+        <w:rPr>
+          <w:rFonts w:ascii="Courier New" w:cs="Courier New" w:eastAsia="Courier New" w:hAnsi="Courier New"/>
+          <w:color w:val="334155"/>
+          <w:sz w:val="18"/>
+          <w:szCs w:val="18"/>
+        </w:rPr>
+        <w:t xml:space="preserve">          &lt;grantedOn&gt;2024-06-15T00:00:00&lt;/grantedOn&gt;</w:t>
+      </w:r>
+    </w:p>
+    <w:p>
+      <w:pPr>
+        <w:spacing w:after="80" w:before="80" w:line="250"/>
+        <w:ind w:left="360"/>
+      </w:pPr>
+      <w:r>
+        <w:rPr>
+          <w:rFonts w:ascii="Courier New" w:cs="Courier New" w:eastAsia="Courier New" w:hAnsi="Courier New"/>
+          <w:color w:val="334155"/>
+          <w:sz w:val="18"/>
+          <w:szCs w:val="18"/>
+        </w:rPr>
+        <w:t xml:space="preserve">          &lt;initialAmount&gt;5000.00&lt;/initialAmount&gt;</w:t>
+      </w:r>
+    </w:p>
+    <w:p>
+      <w:pPr>
+        <w:spacing w:after="80" w:before="80" w:line="250"/>
+        <w:ind w:left="360"/>
+      </w:pPr>
+      <w:r>
+        <w:rPr>
+          <w:rFonts w:ascii="Courier New" w:cs="Courier New" w:eastAsia="Courier New" w:hAnsi="Courier New"/>
+          <w:color w:val="334155"/>
+          <w:sz w:val="18"/>
+          <w:szCs w:val="18"/>
+        </w:rPr>
+        <w:t xml:space="preserve">          &lt;lineAmount/&gt;</w:t>
+      </w:r>
+    </w:p>
+    <w:p>
+      <w:pPr>
+        <w:spacing w:after="80" w:before="80" w:line="250"/>
+        <w:ind w:left="360"/>
+      </w:pPr>
+      <w:r>
+        <w:rPr>
+          <w:rFonts w:ascii="Courier New" w:cs="Courier New" w:eastAsia="Courier New" w:hAnsi="Courier New"/>
+          <w:color w:val="334155"/>
+          <w:sz w:val="18"/>
+          <w:szCs w:val="18"/>
+        </w:rPr>
+        <w:t xml:space="preserve">          &lt;daysInterestOverdue&gt;0&lt;/daysInterestOverdue&gt;</w:t>
+      </w:r>
+    </w:p>
+    <w:p>
+      <w:pPr>
+        <w:spacing w:after="80" w:before="80" w:line="250"/>
+        <w:ind w:left="360"/>
+      </w:pPr>
+      <w:r>
+        <w:rPr>
+          <w:rFonts w:ascii="Courier New" w:cs="Courier New" w:eastAsia="Courier New" w:hAnsi="Courier New"/>
+          <w:color w:val="334155"/>
+          <w:sz w:val="18"/>
+          <w:szCs w:val="18"/>
+        </w:rPr>
+        <w:t xml:space="preserve">          &lt;daysMainSumOverdue&gt;0&lt;/daysMainSumOverdue&gt;</w:t>
+      </w:r>
+    </w:p>
+    <w:p>
+      <w:pPr>
+        <w:spacing w:after="80" w:before="80" w:line="250"/>
+        <w:ind w:left="360"/>
+      </w:pPr>
+      <w:r>
+        <w:rPr>
+          <w:rFonts w:ascii="Courier New" w:cs="Courier New" w:eastAsia="Courier New" w:hAnsi="Courier New"/>
+          <w:color w:val="334155"/>
+          <w:sz w:val="18"/>
+          <w:szCs w:val="18"/>
+        </w:rPr>
+        <w:t xml:space="preserve">          &lt;contractDueOn&gt;2027-06-15T00:00:00&lt;/contractDueOn&gt;</w:t>
+      </w:r>
+    </w:p>
+    <w:p>
+      <w:pPr>
+        <w:spacing w:after="80" w:before="80" w:line="250"/>
+        <w:ind w:left="360"/>
+      </w:pPr>
+      <w:r>
+        <w:rPr>
+          <w:rFonts w:ascii="Courier New" w:cs="Courier New" w:eastAsia="Courier New" w:hAnsi="Courier New"/>
+          <w:color w:val="334155"/>
+          <w:sz w:val="18"/>
+          <w:szCs w:val="18"/>
+        </w:rPr>
+        <w:t xml:space="preserve">          &lt;interestRate&gt;12.50&lt;/interestRate&gt;</w:t>
+      </w:r>
+    </w:p>
+    <w:p>
+      <w:pPr>
+        <w:spacing w:after="80" w:before="80" w:line="250"/>
+        <w:ind w:left="360"/>
+      </w:pPr>
+      <w:r>
+        <w:rPr>
+          <w:rFonts w:ascii="Courier New" w:cs="Courier New" w:eastAsia="Courier New" w:hAnsi="Courier New"/>
+          <w:color w:val="334155"/>
+          <w:sz w:val="18"/>
+          <w:szCs w:val="18"/>
+        </w:rPr>
+        <w:t xml:space="preserve">          &lt;lastUpdatedDate&gt;2026-04-01T00:00:00&lt;/lastUpdatedDate&gt;</w:t>
+      </w:r>
+    </w:p>
+    <w:p>
+      <w:pPr>
+        <w:spacing w:after="80" w:before="80" w:line="250"/>
+        <w:ind w:left="360"/>
+      </w:pPr>
+      <w:r>
+        <w:rPr>
+          <w:rFonts w:ascii="Courier New" w:cs="Courier New" w:eastAsia="Courier New" w:hAnsi="Courier New"/>
+          <w:color w:val="334155"/>
+          <w:sz w:val="18"/>
+          <w:szCs w:val="18"/>
+        </w:rPr>
+        <w:t xml:space="preserve">          &lt;lastPaymentDate&gt;2026-03-15T00:00:00&lt;/lastPaymentDate&gt;</w:t>
+      </w:r>
+    </w:p>
+    <w:p>
+      <w:pPr>
+        <w:spacing w:after="80" w:before="80" w:line="250"/>
+        <w:ind w:left="360"/>
+      </w:pPr>
+      <w:r>
+        <w:rPr>
+          <w:rFonts w:ascii="Courier New" w:cs="Courier New" w:eastAsia="Courier New" w:hAnsi="Courier New"/>
+          <w:color w:val="334155"/>
+          <w:sz w:val="18"/>
+          <w:szCs w:val="18"/>
+        </w:rPr>
+        <w:t xml:space="preserve">          &lt;outstandingDebtMain&gt;3200.00&lt;/outstandingDebtMain&gt;</w:t>
+      </w:r>
+    </w:p>
+    <w:p>
+      <w:pPr>
+        <w:spacing w:after="80" w:before="80" w:line="250"/>
+        <w:ind w:left="360"/>
+      </w:pPr>
+      <w:r>
+        <w:rPr>
+          <w:rFonts w:ascii="Courier New" w:cs="Courier New" w:eastAsia="Courier New" w:hAnsi="Courier New"/>
+          <w:color w:val="334155"/>
+          <w:sz w:val="18"/>
+          <w:szCs w:val="18"/>
+        </w:rPr>
+        <w:t xml:space="preserve">          &lt;outstandingDebtInterest&gt;45.00&lt;/outstandingDebtInterest&gt;</w:t>
+      </w:r>
+    </w:p>
+    <w:p>
+      <w:pPr>
+        <w:spacing w:after="80" w:before="80" w:line="250"/>
+        <w:ind w:left="360"/>
+      </w:pPr>
+      <w:r>
+        <w:rPr>
+          <w:rFonts w:ascii="Courier New" w:cs="Courier New" w:eastAsia="Courier New" w:hAnsi="Courier New"/>
+          <w:color w:val="334155"/>
+          <w:sz w:val="18"/>
+          <w:szCs w:val="18"/>
+        </w:rPr>
+        <w:t xml:space="preserve">          &lt;monthlyPaymentAmount&gt;168.50&lt;/monthlyPaymentAmount&gt;</w:t>
+      </w:r>
+    </w:p>
+    <w:p>
+      <w:pPr>
+        <w:spacing w:after="80" w:before="80" w:line="250"/>
+        <w:ind w:left="360"/>
+      </w:pPr>
+      <w:r>
+        <w:rPr>
+          <w:rFonts w:ascii="Courier New" w:cs="Courier New" w:eastAsia="Courier New" w:hAnsi="Courier New"/>
+          <w:color w:val="334155"/>
+          <w:sz w:val="18"/>
+          <w:szCs w:val="18"/>
+        </w:rPr>
+        <w:t xml:space="preserve">          &lt;prolongations&gt;0&lt;/prolongations&gt;</w:t>
+      </w:r>
+    </w:p>
+    <w:p>
+      <w:pPr>
+        <w:spacing w:after="80" w:before="80" w:line="250"/>
+        <w:ind w:left="360"/>
+      </w:pPr>
+      <w:r>
+        <w:rPr>
+          <w:rFonts w:ascii="Courier New" w:cs="Courier New" w:eastAsia="Courier New" w:hAnsi="Courier New"/>
+          <w:color w:val="334155"/>
+          <w:sz w:val="18"/>
+          <w:szCs w:val="18"/>
+        </w:rPr>
+        <w:t xml:space="preserve">          &lt;creditStatus&gt;007&lt;/creditStatus&gt;</w:t>
+      </w:r>
+    </w:p>
+    <w:p>
+      <w:pPr>
+        <w:spacing w:after="80" w:before="80" w:line="250"/>
+        <w:ind w:left="360"/>
+      </w:pPr>
+      <w:r>
+        <w:rPr>
+          <w:rFonts w:ascii="Courier New" w:cs="Courier New" w:eastAsia="Courier New" w:hAnsi="Courier New"/>
+          <w:color w:val="334155"/>
+          <w:sz w:val="18"/>
+          <w:szCs w:val="18"/>
+        </w:rPr>
+        <w:t xml:space="preserve">          &lt;creditStatusName&gt;Aktiv&lt;/creditStatusName&gt;</w:t>
+      </w:r>
+    </w:p>
+    <w:p>
+      <w:pPr>
+        <w:spacing w:after="80" w:before="80" w:line="250"/>
+        <w:ind w:left="360"/>
+      </w:pPr>
+      <w:r>
+        <w:rPr>
+          <w:rFonts w:ascii="Courier New" w:cs="Courier New" w:eastAsia="Courier New" w:hAnsi="Courier New"/>
+          <w:color w:val="334155"/>
+          <w:sz w:val="18"/>
+          <w:szCs w:val="18"/>
+        </w:rPr>
+        <w:t xml:space="preserve">          &lt;creditStatusCloseDate/&gt;</w:t>
+      </w:r>
+    </w:p>
+    <w:p>
+      <w:pPr>
+        <w:spacing w:after="80" w:before="80" w:line="250"/>
+        <w:ind w:left="360"/>
+      </w:pPr>
+      <w:r>
+        <w:rPr>
+          <w:rFonts w:ascii="Courier New" w:cs="Courier New" w:eastAsia="Courier New" w:hAnsi="Courier New"/>
+          <w:color w:val="334155"/>
+          <w:sz w:val="18"/>
+          <w:szCs w:val="18"/>
+        </w:rPr>
+        <w:t xml:space="preserve">          &lt;creditPurpose&gt;001&lt;/creditPurpose&gt;</w:t>
+      </w:r>
+    </w:p>
+    <w:p>
+      <w:pPr>
+        <w:spacing w:after="80" w:before="80" w:line="250"/>
+        <w:ind w:left="360"/>
+      </w:pPr>
+      <w:r>
+        <w:rPr>
+          <w:rFonts w:ascii="Courier New" w:cs="Courier New" w:eastAsia="Courier New" w:hAnsi="Courier New"/>
+          <w:color w:val="334155"/>
+          <w:sz w:val="18"/>
+          <w:szCs w:val="18"/>
+        </w:rPr>
+        <w:t xml:space="preserve">          &lt;creditPurposeName&gt;Istehlak krediti&lt;/creditPurposeName&gt;</w:t>
+      </w:r>
+    </w:p>
+    <w:p>
+      <w:pPr>
+        <w:spacing w:after="80" w:before="80" w:line="250"/>
+        <w:ind w:left="360"/>
+      </w:pPr>
+      <w:r>
+        <w:rPr>
+          <w:rFonts w:ascii="Courier New" w:cs="Courier New" w:eastAsia="Courier New" w:hAnsi="Courier New"/>
+          <w:color w:val="334155"/>
+          <w:sz w:val="18"/>
+          <w:szCs w:val="18"/>
+        </w:rPr>
+        <w:t xml:space="preserve">          &lt;currency&gt;AZN&lt;/currency&gt;</w:t>
+      </w:r>
+    </w:p>
+    <w:p>
+      <w:pPr>
+        <w:spacing w:after="80" w:before="80" w:line="250"/>
+        <w:ind w:left="360"/>
+      </w:pPr>
+      <w:r>
+        <w:rPr>
+          <w:rFonts w:ascii="Courier New" w:cs="Courier New" w:eastAsia="Courier New" w:hAnsi="Courier New"/>
+          <w:color w:val="334155"/>
+          <w:sz w:val="18"/>
+          <w:szCs w:val="18"/>
+        </w:rPr>
+        <w:t xml:space="preserve">          &lt;currencyName&gt;Manat&lt;/currencyName&gt;</w:t>
+      </w:r>
+    </w:p>
+    <w:p>
+      <w:pPr>
+        <w:spacing w:after="80" w:before="80" w:line="250"/>
+        <w:ind w:left="360"/>
+      </w:pPr>
+      <w:r>
+        <w:rPr>
+          <w:rFonts w:ascii="Courier New" w:cs="Courier New" w:eastAsia="Courier New" w:hAnsi="Courier New"/>
+          <w:color w:val="334155"/>
+          <w:sz w:val="18"/>
+          <w:szCs w:val="18"/>
+        </w:rPr>
+        <w:t xml:space="preserve">          &lt;currencyRate&gt;1&lt;/currencyRate&gt;</w:t>
+      </w:r>
+    </w:p>
+    <w:p>
+      <w:pPr>
+        <w:spacing w:after="80" w:before="80" w:line="250"/>
+        <w:ind w:left="360"/>
+      </w:pPr>
+      <w:r>
+        <w:rPr>
+          <w:rFonts w:ascii="Courier New" w:cs="Courier New" w:eastAsia="Courier New" w:hAnsi="Courier New"/>
+          <w:color w:val="334155"/>
+          <w:sz w:val="18"/>
+          <w:szCs w:val="18"/>
+        </w:rPr>
+        <w:t xml:space="preserve">          &lt;mkrId&gt;MKR-000123&lt;/mkrId&gt;</w:t>
+      </w:r>
+    </w:p>
+    <w:p>
+      <w:pPr>
+        <w:spacing w:after="80" w:before="80" w:line="250"/>
+        <w:ind w:left="360"/>
+      </w:pPr>
+      <w:r>
+        <w:rPr>
+          <w:rFonts w:ascii="Courier New" w:cs="Courier New" w:eastAsia="Courier New" w:hAnsi="Courier New"/>
+          <w:color w:val="334155"/>
+          <w:sz w:val="18"/>
+          <w:szCs w:val="18"/>
+        </w:rPr>
+        <w:t xml:space="preserve">          &lt;collateralCode&gt;001&lt;/collateralCode&gt;</w:t>
+      </w:r>
+    </w:p>
+    <w:p>
+      <w:pPr>
+        <w:spacing w:after="80" w:before="80" w:line="250"/>
+        <w:ind w:left="360"/>
+      </w:pPr>
+      <w:r>
+        <w:rPr>
+          <w:rFonts w:ascii="Courier New" w:cs="Courier New" w:eastAsia="Courier New" w:hAnsi="Courier New"/>
+          <w:color w:val="334155"/>
+          <w:sz w:val="18"/>
+          <w:szCs w:val="18"/>
+        </w:rPr>
+        <w:t xml:space="preserve">          &lt;collateralTypeName&gt;Dasinmaz emlak&lt;/collateralTypeName&gt;</w:t>
+      </w:r>
+    </w:p>
+    <w:p>
+      <w:pPr>
+        <w:spacing w:after="80" w:before="80" w:line="250"/>
+        <w:ind w:left="360"/>
+      </w:pPr>
+      <w:r>
+        <w:rPr>
+          <w:rFonts w:ascii="Courier New" w:cs="Courier New" w:eastAsia="Courier New" w:hAnsi="Courier New"/>
+          <w:color w:val="334155"/>
+          <w:sz w:val="18"/>
+          <w:szCs w:val="18"/>
+        </w:rPr>
+        <w:t xml:space="preserve">          &lt;collateralMarketValue&gt;8000.00&lt;/collateralMarketValue&gt;</w:t>
+      </w:r>
+    </w:p>
+    <w:p>
+      <w:pPr>
+        <w:spacing w:after="80" w:before="80" w:line="250"/>
+        <w:ind w:left="360"/>
+      </w:pPr>
+      <w:r>
+        <w:rPr>
+          <w:rFonts w:ascii="Courier New" w:cs="Courier New" w:eastAsia="Courier New" w:hAnsi="Courier New"/>
+          <w:color w:val="334155"/>
+          <w:sz w:val="18"/>
+          <w:szCs w:val="18"/>
+        </w:rPr>
+        <w:t xml:space="preserve">          &lt;collateralRegistryAgency&gt;DQIK&lt;/collateralRegistryAgency&gt;</w:t>
+      </w:r>
+    </w:p>
+    <w:p>
+      <w:pPr>
+        <w:spacing w:after="80" w:before="80" w:line="250"/>
+        <w:ind w:left="360"/>
+      </w:pPr>
+      <w:r>
+        <w:rPr>
+          <w:rFonts w:ascii="Courier New" w:cs="Courier New" w:eastAsia="Courier New" w:hAnsi="Courier New"/>
+          <w:color w:val="334155"/>
+          <w:sz w:val="18"/>
+          <w:szCs w:val="18"/>
+        </w:rPr>
+        <w:t xml:space="preserve">          &lt;collateralRegistryDate&gt;2024-06-10T00:00:00&lt;/collateralRegistryDate&gt;</w:t>
+      </w:r>
+    </w:p>
+    <w:p>
+      <w:pPr>
+        <w:spacing w:after="80" w:before="80" w:line="250"/>
+        <w:ind w:left="360"/>
+      </w:pPr>
+      <w:r>
+        <w:rPr>
+          <w:rFonts w:ascii="Courier New" w:cs="Courier New" w:eastAsia="Courier New" w:hAnsi="Courier New"/>
+          <w:color w:val="334155"/>
+          <w:sz w:val="18"/>
+          <w:szCs w:val="18"/>
+        </w:rPr>
+        <w:t xml:space="preserve">          &lt;collateralRegistryNo&gt;REG-2024-001&lt;/collateralRegistryNo&gt;</w:t>
+      </w:r>
+    </w:p>
+    <w:p>
+      <w:pPr>
+        <w:spacing w:after="80" w:before="80" w:line="250"/>
+        <w:ind w:left="360"/>
+      </w:pPr>
+      <w:r>
+        <w:rPr>
+          <w:rFonts w:ascii="Courier New" w:cs="Courier New" w:eastAsia="Courier New" w:hAnsi="Courier New"/>
+          <w:color w:val="334155"/>
+          <w:sz w:val="18"/>
+          <w:szCs w:val="18"/>
+        </w:rPr>
+        <w:t xml:space="preserve">          &lt;collateralAnyInfo/&gt;</w:t>
+      </w:r>
+    </w:p>
+    <w:p>
+      <w:pPr>
+        <w:spacing w:after="80" w:before="80" w:line="250"/>
+        <w:ind w:left="360"/>
+      </w:pPr>
+      <w:r>
+        <w:rPr>
+          <w:rFonts w:ascii="Courier New" w:cs="Courier New" w:eastAsia="Courier New" w:hAnsi="Courier New"/>
+          <w:color w:val="334155"/>
+          <w:sz w:val="18"/>
+          <w:szCs w:val="18"/>
+        </w:rPr>
+        <w:t xml:space="preserve">          &lt;history&gt;</w:t>
+      </w:r>
+    </w:p>
+    <w:p>
+      <w:pPr>
+        <w:spacing w:after="80" w:before="80" w:line="250"/>
+        <w:ind w:left="360"/>
+      </w:pPr>
+      <w:r>
+        <w:rPr>
+          <w:rFonts w:ascii="Courier New" w:cs="Courier New" w:eastAsia="Courier New" w:hAnsi="Courier New"/>
+          <w:color w:val="334155"/>
+          <w:sz w:val="18"/>
+          <w:szCs w:val="18"/>
+        </w:rPr>
+        <w:t xml:space="preserve">            &lt;historyItem&gt;</w:t>
+      </w:r>
+    </w:p>
+    <w:p>
+      <w:pPr>
+        <w:spacing w:after="80" w:before="80" w:line="250"/>
+        <w:ind w:left="360"/>
+      </w:pPr>
+      <w:r>
+        <w:rPr>
+          <w:rFonts w:ascii="Courier New" w:cs="Courier New" w:eastAsia="Courier New" w:hAnsi="Courier New"/>
+          <w:color w:val="334155"/>
+          <w:sz w:val="18"/>
+          <w:szCs w:val="18"/>
+        </w:rPr>
+        <w:t xml:space="preserve">              &lt;overdueDays&gt;0&lt;/overdueDays&gt;</w:t>
+      </w:r>
+    </w:p>
+    <w:p>
+      <w:pPr>
+        <w:spacing w:after="80" w:before="80" w:line="250"/>
+        <w:ind w:left="360"/>
+      </w:pPr>
+      <w:r>
+        <w:rPr>
+          <w:rFonts w:ascii="Courier New" w:cs="Courier New" w:eastAsia="Courier New" w:hAnsi="Courier New"/>
+          <w:color w:val="334155"/>
+          <w:sz w:val="18"/>
+          <w:szCs w:val="18"/>
+        </w:rPr>
+        <w:t xml:space="preserve">              &lt;reportingPeriod&gt;03x2026&lt;/reportingPeriod&gt;</w:t>
+      </w:r>
+    </w:p>
+    <w:p>
+      <w:pPr>
+        <w:spacing w:after="80" w:before="80" w:line="250"/>
+        <w:ind w:left="360"/>
+      </w:pPr>
+      <w:r>
+        <w:rPr>
+          <w:rFonts w:ascii="Courier New" w:cs="Courier New" w:eastAsia="Courier New" w:hAnsi="Courier New"/>
+          <w:color w:val="334155"/>
+          <w:sz w:val="18"/>
+          <w:szCs w:val="18"/>
+        </w:rPr>
+        <w:t xml:space="preserve">              &lt;creditStatus&gt;007&lt;/creditStatus&gt;</w:t>
+      </w:r>
+    </w:p>
+    <w:p>
+      <w:pPr>
+        <w:spacing w:after="80" w:before="80" w:line="250"/>
+        <w:ind w:left="360"/>
+      </w:pPr>
+      <w:r>
+        <w:rPr>
+          <w:rFonts w:ascii="Courier New" w:cs="Courier New" w:eastAsia="Courier New" w:hAnsi="Courier New"/>
+          <w:color w:val="334155"/>
+          <w:sz w:val="18"/>
+          <w:szCs w:val="18"/>
+        </w:rPr>
+        <w:t xml:space="preserve">            &lt;/historyItem&gt;</w:t>
+      </w:r>
+    </w:p>
+    <w:p>
+      <w:pPr>
+        <w:spacing w:after="80" w:before="80" w:line="250"/>
+        <w:ind w:left="360"/>
+      </w:pPr>
+      <w:r>
+        <w:rPr>
+          <w:rFonts w:ascii="Courier New" w:cs="Courier New" w:eastAsia="Courier New" w:hAnsi="Courier New"/>
+          <w:color w:val="334155"/>
+          <w:sz w:val="18"/>
+          <w:szCs w:val="18"/>
+        </w:rPr>
+        <w:t xml:space="preserve">            &lt;historyItem&gt;</w:t>
+      </w:r>
+    </w:p>
+    <w:p>
+      <w:pPr>
+        <w:spacing w:after="80" w:before="80" w:line="250"/>
+        <w:ind w:left="360"/>
+      </w:pPr>
+      <w:r>
+        <w:rPr>
+          <w:rFonts w:ascii="Courier New" w:cs="Courier New" w:eastAsia="Courier New" w:hAnsi="Courier New"/>
+          <w:color w:val="334155"/>
+          <w:sz w:val="18"/>
+          <w:szCs w:val="18"/>
+        </w:rPr>
+        <w:t xml:space="preserve">              &lt;overdueDays&gt;0&lt;/overdueDays&gt;</w:t>
+      </w:r>
+    </w:p>
+    <w:p>
+      <w:pPr>
+        <w:spacing w:after="80" w:before="80" w:line="250"/>
+        <w:ind w:left="360"/>
+      </w:pPr>
+      <w:r>
+        <w:rPr>
+          <w:rFonts w:ascii="Courier New" w:cs="Courier New" w:eastAsia="Courier New" w:hAnsi="Courier New"/>
+          <w:color w:val="334155"/>
+          <w:sz w:val="18"/>
+          <w:szCs w:val="18"/>
+        </w:rPr>
+        <w:t xml:space="preserve">              &lt;reportingPeriod&gt;02x2026&lt;/reportingPeriod&gt;</w:t>
+      </w:r>
+    </w:p>
+    <w:p>
+      <w:pPr>
+        <w:spacing w:after="80" w:before="80" w:line="250"/>
+        <w:ind w:left="360"/>
+      </w:pPr>
+      <w:r>
+        <w:rPr>
+          <w:rFonts w:ascii="Courier New" w:cs="Courier New" w:eastAsia="Courier New" w:hAnsi="Courier New"/>
+          <w:color w:val="334155"/>
+          <w:sz w:val="18"/>
+          <w:szCs w:val="18"/>
+        </w:rPr>
+        <w:t xml:space="preserve">              &lt;creditStatus&gt;007&lt;/creditStatus&gt;</w:t>
+      </w:r>
+    </w:p>
+    <w:p>
+      <w:pPr>
+        <w:spacing w:after="80" w:before="80" w:line="250"/>
+        <w:ind w:left="360"/>
+      </w:pPr>
+      <w:r>
+        <w:rPr>
+          <w:rFonts w:ascii="Courier New" w:cs="Courier New" w:eastAsia="Courier New" w:hAnsi="Courier New"/>
+          <w:color w:val="334155"/>
+          <w:sz w:val="18"/>
+          <w:szCs w:val="18"/>
+        </w:rPr>
+        <w:t xml:space="preserve">            &lt;/historyItem&gt;</w:t>
+      </w:r>
+    </w:p>
+    <w:p>
+      <w:pPr>
+        <w:spacing w:after="80" w:before="80" w:line="250"/>
+        <w:ind w:left="360"/>
+      </w:pPr>
+      <w:r>
+        <w:rPr>
+          <w:rFonts w:ascii="Courier New" w:cs="Courier New" w:eastAsia="Courier New" w:hAnsi="Courier New"/>
+          <w:color w:val="334155"/>
+          <w:sz w:val="18"/>
+          <w:szCs w:val="18"/>
+        </w:rPr>
+        <w:t xml:space="preserve">          &lt;/history&gt;</w:t>
+      </w:r>
+    </w:p>
+    <w:p>
+      <w:pPr>
+        <w:spacing w:after="80" w:before="80" w:line="250"/>
+        <w:ind w:left="360"/>
+      </w:pPr>
+      <w:r>
+        <w:rPr>
+          <w:rFonts w:ascii="Courier New" w:cs="Courier New" w:eastAsia="Courier New" w:hAnsi="Courier New"/>
+          <w:color w:val="334155"/>
+          <w:sz w:val="18"/>
+          <w:szCs w:val="18"/>
+        </w:rPr>
+        <w:t xml:space="preserve">        &lt;/liability&gt;</w:t>
+      </w:r>
+    </w:p>
+    <w:p>
+      <w:pPr>
+        <w:spacing w:after="80" w:before="80" w:line="250"/>
+        <w:ind w:left="360"/>
+      </w:pPr>
+      <w:r>
+        <w:rPr>
+          <w:rFonts w:ascii="Courier New" w:cs="Courier New" w:eastAsia="Courier New" w:hAnsi="Courier New"/>
+          <w:color w:val="334155"/>
+          <w:sz w:val="18"/>
+          <w:szCs w:val="18"/>
+        </w:rPr>
+        <w:t xml:space="preserve">      &lt;/liabilities&gt;</w:t>
       </w:r>
     </w:p>
     <w:p>
@@ -34838,6 +38133,14 @@
     </w:lvlOverride>
   </w:num>
 </w:numbering>
+</file>
+
+<file path=word/people.xml><?xml version="1.0" encoding="utf-8"?>
+<w15:people xmlns:w15="http://schemas.microsoft.com/office/word/2012/wordml">
+  <w15:person w15:author="GLM">
+    <w15:presenceInfo w15:providerId="None" w15:userId="GLM"/>
+  </w15:person>
+</w15:people>
 </file>
 
 <file path=word/styles.xml><?xml version="1.0" encoding="utf-8"?>

</xml_diff>

<commit_message>
fix: Kredit odənişləri bölməsi - TEST heading silindi, Mündəricat yeniləndi
</commit_message>
<xml_diff>
--- a/Tekniki_Inteqrasiya_Senedi.docx
+++ b/Tekniki_Inteqrasiya_Senedi.docx
@@ -839,6 +839,201 @@
         </w:p>
       </w:sdtContent>
     </w:sdt>
+    <w:p>
+      <w:pPr>
+        <w:sectPr>
+          <w:headerReference w:type="default" r:id="rId7"/>
+          <w:footerReference w:type="default" r:id="rId8"/>
+          <w:pgSz w:w="11906" w:h="16838" w:orient="portrait"/>
+          <w:pgMar w:top="1800" w:right="1440" w:bottom="1440" w:left="1440" w:header="708" w:footer="708" w:gutter="0"/>
+          <w:pgNumType/>
+          <w:docGrid w:linePitch="360"/>
+        </w:sectPr>
+      </w:pPr>
+      <w:r>
+        <w:t xml:space="preserve">9. Kredit Ödənişlərinin Qəbulu (EmbafinanceLoanInformationalService &amp; RepaymentRegistrationService)</w:t>
+      </w:r>
+    </w:p>
+    <w:p>
+      <w:pPr>
+        <w:sectPr>
+          <w:headerReference w:type="default" r:id="rId7"/>
+          <w:footerReference w:type="default" r:id="rId8"/>
+          <w:pgSz w:w="11906" w:h="16838" w:orient="portrait"/>
+          <w:pgMar w:top="1800" w:right="1440" w:bottom="1440" w:left="1440" w:header="708" w:footer="708" w:gutter="0"/>
+          <w:pgNumType/>
+          <w:docGrid w:linePitch="360"/>
+        </w:sectPr>
+      </w:pPr>
+      <w:r>
+        <w:t xml:space="preserve">    9.1 Xidmətin adı və təyinatı</w:t>
+      </w:r>
+    </w:p>
+    <w:p>
+      <w:pPr>
+        <w:sectPr>
+          <w:headerReference w:type="default" r:id="rId7"/>
+          <w:footerReference w:type="default" r:id="rId8"/>
+          <w:pgSz w:w="11906" w:h="16838" w:orient="portrait"/>
+          <w:pgMar w:top="1800" w:right="1440" w:bottom="1440" w:left="1440" w:header="708" w:footer="708" w:gutter="0"/>
+          <w:pgNumType/>
+          <w:docGrid w:linePitch="360"/>
+        </w:sectPr>
+      </w:pPr>
+      <w:r>
+        <w:t xml:space="preserve">    9.2 Endpoint detalları</w:t>
+      </w:r>
+    </w:p>
+    <w:p>
+      <w:pPr>
+        <w:sectPr>
+          <w:headerReference w:type="default" r:id="rId7"/>
+          <w:footerReference w:type="default" r:id="rId8"/>
+          <w:pgSz w:w="11906" w:h="16838" w:orient="portrait"/>
+          <w:pgMar w:top="1800" w:right="1440" w:bottom="1440" w:left="1440" w:header="708" w:footer="708" w:gutter="0"/>
+          <w:pgNumType/>
+          <w:docGrid w:linePitch="360"/>
+        </w:sectPr>
+      </w:pPr>
+      <w:r>
+        <w:t xml:space="preserve">    9.3 showPersonLoansDue</w:t>
+      </w:r>
+    </w:p>
+    <w:p>
+      <w:pPr>
+        <w:sectPr>
+          <w:headerReference w:type="default" r:id="rId7"/>
+          <w:footerReference w:type="default" r:id="rId8"/>
+          <w:pgSz w:w="11906" w:h="16838" w:orient="portrait"/>
+          <w:pgMar w:top="1800" w:right="1440" w:bottom="1440" w:left="1440" w:header="708" w:footer="708" w:gutter="0"/>
+          <w:pgNumType/>
+          <w:docGrid w:linePitch="360"/>
+        </w:sectPr>
+      </w:pPr>
+      <w:r>
+        <w:t xml:space="preserve">    9.4 showPaymentOrderInfo</w:t>
+      </w:r>
+    </w:p>
+    <w:p>
+      <w:pPr>
+        <w:sectPr>
+          <w:headerReference w:type="default" r:id="rId7"/>
+          <w:footerReference w:type="default" r:id="rId8"/>
+          <w:pgSz w:w="11906" w:h="16838" w:orient="portrait"/>
+          <w:pgMar w:top="1800" w:right="1440" w:bottom="1440" w:left="1440" w:header="708" w:footer="708" w:gutter="0"/>
+          <w:pgNumType/>
+          <w:docGrid w:linePitch="360"/>
+        </w:sectPr>
+      </w:pPr>
+      <w:r>
+        <w:t xml:space="preserve">    9.5 registerRepayment</w:t>
+      </w:r>
+    </w:p>
+    <w:p>
+      <w:pPr>
+        <w:sectPr>
+          <w:headerReference w:type="default" r:id="rId7"/>
+          <w:footerReference w:type="default" r:id="rId8"/>
+          <w:pgSz w:w="11906" w:h="16838" w:orient="portrait"/>
+          <w:pgMar w:top="1800" w:right="1440" w:bottom="1440" w:left="1440" w:header="708" w:footer="708" w:gutter="0"/>
+          <w:pgNumType/>
+          <w:docGrid w:linePitch="360"/>
+        </w:sectPr>
+      </w:pPr>
+      <w:r>
+        <w:t xml:space="preserve">    9.6 addRepayments (Batch)</w:t>
+      </w:r>
+    </w:p>
+    <w:p>
+      <w:pPr>
+        <w:sectPr>
+          <w:headerReference w:type="default" r:id="rId7"/>
+          <w:footerReference w:type="default" r:id="rId8"/>
+          <w:pgSz w:w="11906" w:h="16838" w:orient="portrait"/>
+          <w:pgMar w:top="1800" w:right="1440" w:bottom="1440" w:left="1440" w:header="708" w:footer="708" w:gutter="0"/>
+          <w:pgNumType/>
+          <w:docGrid w:linePitch="360"/>
+        </w:sectPr>
+      </w:pPr>
+      <w:r>
+        <w:t xml:space="preserve">    9.7 addRepaymentsByPartner</w:t>
+      </w:r>
+    </w:p>
+    <w:p>
+      <w:pPr>
+        <w:sectPr>
+          <w:headerReference w:type="default" r:id="rId7"/>
+          <w:footerReference w:type="default" r:id="rId8"/>
+          <w:pgSz w:w="11906" w:h="16838" w:orient="portrait"/>
+          <w:pgMar w:top="1800" w:right="1440" w:bottom="1440" w:left="1440" w:header="708" w:footer="708" w:gutter="0"/>
+          <w:pgNumType/>
+          <w:docGrid w:linePitch="360"/>
+        </w:sectPr>
+      </w:pPr>
+      <w:r>
+        <w:t xml:space="preserve">    9.8 cancelRepayments</w:t>
+      </w:r>
+    </w:p>
+    <w:p>
+      <w:pPr>
+        <w:sectPr>
+          <w:headerReference w:type="default" r:id="rId7"/>
+          <w:footerReference w:type="default" r:id="rId8"/>
+          <w:pgSz w:w="11906" w:h="16838" w:orient="portrait"/>
+          <w:pgMar w:top="1800" w:right="1440" w:bottom="1440" w:left="1440" w:header="708" w:footer="708" w:gutter="0"/>
+          <w:pgNumType/>
+          <w:docGrid w:linePitch="360"/>
+        </w:sectPr>
+      </w:pPr>
+      <w:r>
+        <w:t xml:space="preserve">    9.9 epRepaymentRegistrationService</w:t>
+      </w:r>
+    </w:p>
+    <w:p>
+      <w:pPr>
+        <w:sectPr>
+          <w:headerReference w:type="default" r:id="rId7"/>
+          <w:footerReference w:type="default" r:id="rId8"/>
+          <w:pgSz w:w="11906" w:h="16838" w:orient="portrait"/>
+          <w:pgMar w:top="1800" w:right="1440" w:bottom="1440" w:left="1440" w:header="708" w:footer="708" w:gutter="0"/>
+          <w:pgNumType/>
+          <w:docGrid w:linePitch="360"/>
+        </w:sectPr>
+      </w:pPr>
+      <w:r>
+        <w:t xml:space="preserve">    9.10 Maliyyə Hərəkəti Qeydləri və Təhlükəsizlik Funksiyaları</w:t>
+      </w:r>
+    </w:p>
+    <w:p>
+      <w:pPr>
+        <w:sectPr>
+          <w:headerReference w:type="default" r:id="rId7"/>
+          <w:footerReference w:type="default" r:id="rId8"/>
+          <w:pgSz w:w="11906" w:h="16838" w:orient="portrait"/>
+          <w:pgMar w:top="1800" w:right="1440" w:bottom="1440" w:left="1440" w:header="708" w:footer="708" w:gutter="0"/>
+          <w:pgNumType/>
+          <w:docGrid w:linePitch="360"/>
+        </w:sectPr>
+      </w:pPr>
+      <w:r>
+        <w:t xml:space="preserve">    9.11 Field Descriptions</w:t>
+      </w:r>
+    </w:p>
+    <w:p>
+      <w:pPr>
+        <w:sectPr>
+          <w:headerReference w:type="default" r:id="rId7"/>
+          <w:footerReference w:type="default" r:id="rId8"/>
+          <w:pgSz w:w="11906" w:h="16838" w:orient="portrait"/>
+          <w:pgMar w:top="1800" w:right="1440" w:bottom="1440" w:left="1440" w:header="708" w:footer="708" w:gutter="0"/>
+          <w:pgNumType/>
+          <w:docGrid w:linePitch="360"/>
+        </w:sectPr>
+      </w:pPr>
+      <w:r>
+        <w:t xml:space="preserve">    9.12 Nümunələr</w:t>
+      </w:r>
+    </w:p>
     <w:p>
       <w:pPr>
         <w:spacing w:after="200" w:before="200"/>
@@ -50270,14 +50465,6 @@
         <w:pStyle w:val="Heading1"/>
       </w:pPr>
       <w:r>
-        <w:t>TEST</w:t>
-      </w:r>
-    </w:p>
-    <w:p>
-      <w:pPr>
-        <w:pStyle w:val="Heading1"/>
-      </w:pPr>
-      <w:r>
         <w:t>9. Kredit Ödənişlərinin Qəbulu (EmbafinanceLoanInformationalService &amp; RepaymentRegistrationService)</w:t>
       </w:r>
     </w:p>

</xml_diff>